<commit_message>
Contrato: datos bancarios y aviso antifraude
</commit_message>
<xml_diff>
--- a/gr-tax-legal-presentacion/docs/contrato.docx
+++ b/gr-tax-legal-presentacion/docs/contrato.docx
@@ -57,11 +57,11 @@
         <w:rPr>
           <w:b/>
         </w:rPr>
-        <w:t>[__________]</w:t>
+        <w:t>G&amp;R TAX-LEGAL CONSULTING, S.C.</w:t>
       </w:r>
       <w:r>
         <w:rPr/>
-        <w:t xml:space="preserve"> (denominación o nombre legal), que opera bajo el nombre comercial </w:t>
+        <w:t xml:space="preserve">, que opera bajo el nombre comercial </w:t>
       </w:r>
       <w:r>
         <w:rPr>
@@ -1769,6 +1769,15 @@
       <w:r>
         <w:rPr/>
         <w:t xml:space="preserve"> Los pagos se realizarán en moneda nacional (pesos mexicanos), mediante transferencia electrónica a la cuenta que el Prestador indique por escrito a través de los Canales Autorizados. Si el pago se realiza en moneda extranjera, se aplicará el tipo de cambio publicado por el Banco de México en el Diario Oficial de la Federación el día del pago y las comisiones bancarias y diferencias cambiarias serán a cargo del Cliente, de modo que el Prestador reciba el importe íntegro. Los pagos sólo deberán realizarse desde cuentas a nombre del Cliente, salvo autorización escrita del Prestador. El Prestador no será responsable de pagos hechos a cuentas comunicadas por medios distintos a los Canales Autorizados.</w:t>
+      </w:r>
+      <w:r>
+        <w:rPr>
+          <w:b/>
+        </w:rPr>
+        <w:t xml:space="preserve"> Aviso antifraude:</w:t>
+      </w:r>
+      <w:r>
+        <w:t xml:space="preserve"> los pagos sólo serán válidos y liberatorios si se realizan a la cuenta bancaria a nombre de G&amp;R Tax-Legal Consulting, S.C. señalada en el Anexo B. El Prestador nunca solicitará pagos a cuentas personales ni de terceros; cualquier solicitud en ese sentido, o de cambio de cuenta, deberá considerarse fraudulenta y el Cliente deberá confirmarla previamente por los Canales Autorizados. Los pagos hechos a una cuenta distinta no liberarán al Cliente de su obligación de pago.</w:t>
       </w:r>
     </w:p>
     <w:p>
@@ -4525,7 +4534,18 @@
       </w:pPr>
       <w:r>
         <w:rPr/>
-        <w:t>Los datos bancarios se comunicarán exclusivamente por escrito desde taxgr.interno@gmail.com (Cláusula 8.4). Banco: [__________] · Titular: [__________] · CLABE: [__________].</w:t>
+        <w:t>Los datos bancarios se comunicarán exclusivamente por escrito desde taxgr.interno@gmail.com (Cláusula 8.4). Banco: BBVA · Titular: G&amp;R Tax-Legal Consulting, S.C. · Tipo: Cuenta de cheques · CLABE: 012180001153583297 · Número de cuenta: 0115358329.</w:t>
+      </w:r>
+    </w:p>
+    <w:p>
+      <w:pPr>
+        <w:jc w:val="both"/>
+      </w:pPr>
+      <w:r>
+        <w:rPr>
+          <w:i/>
+        </w:rPr>
+        <w:t>Pagos válidos únicamente a esta cuenta a nombre de G&amp;R Tax-Legal Consulting, S.C. El Prestador nunca solicita pagos a cuentas personales o de terceros (Cláusula 8.4).</w:t>
       </w:r>
     </w:p>
     <w:p>

</xml_diff>

<commit_message>
Contrato: datos fiscales del Prestador (CSF)
</commit_message>
<xml_diff>
--- a/gr-tax-legal-presentacion/docs/contrato.docx
+++ b/gr-tax-legal-presentacion/docs/contrato.docx
@@ -77,7 +77,7 @@
         <w:rPr>
           <w:b/>
         </w:rPr>
-        <w:t>[__________]</w:t>
+        <w:t>GTC200224IU3</w:t>
       </w:r>
       <w:r>
         <w:rPr/>
@@ -213,7 +213,15 @@
       </w:r>
       <w:r>
         <w:rPr/>
-        <w:t xml:space="preserve">Es </w:t>
+        <w:t xml:space="preserve">Es una sociedad civil constituida conforme a las leyes mexicanas, inscrita en el Registro Federal de Contribuyentes con la clave GTC200224IU3 y con fecha de inicio de operaciones el 24 de febrero de 2020 (según su Constancia de Situación Fiscal), según escritura pública número </w:t>
+      </w:r>
+      <w:r>
+        <w:rPr>
+          <w:b/>
+        </w:rPr>
+      </w:r>
+      <w:r>
+        <w:rPr/>
       </w:r>
       <w:r>
         <w:rPr>
@@ -223,7 +231,7 @@
       </w:r>
       <w:r>
         <w:rPr/>
-        <w:t xml:space="preserve"> (persona física con actividad profesional / sociedad constituida conforme a las leyes mexicanas, según escritura pública número </w:t>
+        <w:t xml:space="preserve"> de fecha </w:t>
       </w:r>
       <w:r>
         <w:rPr>
@@ -233,7 +241,7 @@
       </w:r>
       <w:r>
         <w:rPr/>
-        <w:t xml:space="preserve"> de fecha </w:t>
+        <w:t xml:space="preserve">, otorgada ante el Notario Público número </w:t>
       </w:r>
       <w:r>
         <w:rPr>
@@ -243,7 +251,7 @@
       </w:r>
       <w:r>
         <w:rPr/>
-        <w:t xml:space="preserve">, otorgada ante el Notario Público número </w:t>
+        <w:t xml:space="preserve"> de </w:t>
       </w:r>
       <w:r>
         <w:rPr>
@@ -253,75 +261,62 @@
       </w:r>
       <w:r>
         <w:rPr/>
-        <w:t xml:space="preserve"> de </w:t>
+        <w:t>, con plena capacidad para obligarse en los términos del presente Contrato.</w:t>
+      </w:r>
+    </w:p>
+    <w:p>
+      <w:pPr>
+        <w:ind w:left="567" w:hanging="340"/>
+        <w:jc w:val="both"/>
+      </w:pPr>
+      <w:r>
+        <w:t>b)</w:t>
+        <w:tab/>
+      </w:r>
+      <w:r>
+        <w:rPr/>
+        <w:t>Su representante cuenta con las facultades suficientes para celebrar el presente Contrato, mismas que no le han sido revocadas ni limitadas en forma alguna.</w:t>
+      </w:r>
+    </w:p>
+    <w:p>
+      <w:pPr>
+        <w:ind w:left="567" w:hanging="340"/>
+        <w:jc w:val="both"/>
+      </w:pPr>
+      <w:r>
+        <w:t>c)</w:t>
+        <w:tab/>
+      </w:r>
+      <w:r>
+        <w:rPr/>
+        <w:t>Es una firma familiar de consultoría fiscal y legal cuyo equipo cuenta con más de veinticinco años de experiencia en materia legal y más de cinco años de experiencia en la atención de empresas de origen chino, y dispone de los conocimientos, recursos humanos y medios necesarios para prestar los Servicios.</w:t>
+      </w:r>
+    </w:p>
+    <w:p>
+      <w:pPr>
+        <w:ind w:left="567" w:hanging="340"/>
+        <w:jc w:val="both"/>
+      </w:pPr>
+      <w:r>
+        <w:t>d)</w:t>
+        <w:tab/>
+      </w:r>
+      <w:r>
+        <w:rPr/>
+        <w:t>Tiene su domicilio fiscal, que también señala para efectos del presente Contrato, en Calle Ixtlixochitl, Manzana 38, Lote 55, Col. Adolfo Ruiz Cortines, Alcaldía Coyoacán, Ciudad de México, C.P. 04630 (entre Calle Nahuayotzin y Calle Ilhuicamina)</w:t>
       </w:r>
       <w:r>
         <w:rPr>
           <w:b/>
         </w:rPr>
-        <w:t>[__________]</w:t>
       </w:r>
       <w:r>
         <w:rPr/>
-        <w:t>), con plena capacidad para obligarse en los términos del presente Contrato.</w:t>
-      </w:r>
-    </w:p>
-    <w:p>
-      <w:pPr>
-        <w:ind w:left="567" w:hanging="340"/>
-        <w:jc w:val="both"/>
-      </w:pPr>
-      <w:r>
-        <w:t>b)</w:t>
-        <w:tab/>
-      </w:r>
-      <w:r>
-        <w:rPr/>
-        <w:t>Su representante cuenta con las facultades suficientes para celebrar el presente Contrato, mismas que no le han sido revocadas ni limitadas en forma alguna.</w:t>
-      </w:r>
-    </w:p>
-    <w:p>
-      <w:pPr>
-        <w:ind w:left="567" w:hanging="340"/>
-        <w:jc w:val="both"/>
-      </w:pPr>
-      <w:r>
-        <w:t>c)</w:t>
-        <w:tab/>
-      </w:r>
-      <w:r>
-        <w:rPr/>
-        <w:t>Es una firma familiar de consultoría fiscal y legal cuyo equipo cuenta con más de veinticinco años de experiencia en materia legal y más de cinco años de experiencia en la atención de empresas de origen chino, y dispone de los conocimientos, recursos humanos y medios necesarios para prestar los Servicios.</w:t>
-      </w:r>
-    </w:p>
-    <w:p>
-      <w:pPr>
-        <w:ind w:left="567" w:hanging="340"/>
-        <w:jc w:val="both"/>
-      </w:pPr>
-      <w:r>
-        <w:t>d)</w:t>
-        <w:tab/>
-      </w:r>
-      <w:r>
-        <w:rPr/>
-        <w:t xml:space="preserve">Tiene su domicilio para efectos del presente Contrato en </w:t>
       </w:r>
       <w:r>
         <w:rPr>
           <w:b/>
         </w:rPr>
-        <w:t>[__________]</w:t>
-      </w:r>
-      <w:r>
-        <w:rPr/>
-        <w:t xml:space="preserve">, Alcaldía Coyoacán, Ciudad de México, C.P. </w:t>
-      </w:r>
-      <w:r>
-        <w:rPr>
-          <w:b/>
-        </w:rPr>
-        <w:t>[__________]</w:t>
       </w:r>
       <w:r>
         <w:rPr/>

</xml_diff>

<commit_message>
Teléfonos y razón social S.C.
</commit_message>
<xml_diff>
--- a/gr-tax-legal-presentacion/docs/contrato.docx
+++ b/gr-tax-legal-presentacion/docs/contrato.docx
@@ -23,7 +23,7 @@
         <w:rPr>
           <w:sz w:val="21"/>
         </w:rPr>
-        <w:t>G&amp;R TAX-LEGAL CONSULTING</w:t>
+        <w:t>G&amp;R TAX-LEGAL CONSULTING, S.C.</w:t>
       </w:r>
       <w:r>
         <w:br/>
@@ -32,7 +32,7 @@
         <w:rPr>
           <w:sz w:val="21"/>
         </w:rPr>
-        <w:t>Coyoacán, Ciudad de México · Av. Eje 10 Sur 156, Col. Selene, Tláhuac, Ciudad de México · taxgr.interno@gmail.com</w:t>
+        <w:t>Coyoacán, Ciudad de México · Av. Eje 10 Sur 156, Col. Selene, Tláhuac, Ciudad de México · taxgr.interno@gmail.com · Tel. +52 55 7914 2013 y +52 55 3913 6467</w:t>
       </w:r>
     </w:p>
     <w:p>
@@ -320,7 +320,7 @@
       </w:r>
       <w:r>
         <w:rPr/>
-        <w:t>, y cuenta además con oficina en Av. Eje 10 Sur 156, Col. Selene, Alcaldía Tláhuac, Ciudad de México.</w:t>
+        <w:t>, y cuenta además con oficina en Av. Eje 10 Sur 156, Col. Selene, Alcaldía Tláhuac, Ciudad de México. Sus teléfonos de contacto son +52 55 7914 2013 y +52 55 3913 6467.</w:t>
       </w:r>
     </w:p>
     <w:p>
@@ -1772,7 +1772,7 @@
         <w:t xml:space="preserve"> Aviso antifraude:</w:t>
       </w:r>
       <w:r>
-        <w:t xml:space="preserve"> los pagos sólo serán válidos y liberatorios si se realizan a la cuenta bancaria a nombre de G&amp;R Tax-Legal Consulting, S.C. señalada en el Anexo B. El Prestador nunca solicitará pagos a cuentas personales ni de terceros; cualquier solicitud en ese sentido, o de cambio de cuenta, deberá considerarse fraudulenta y el Cliente deberá confirmarla previamente por los Canales Autorizados. Los pagos hechos a una cuenta distinta no liberarán al Cliente de su obligación de pago.</w:t>
+        <w:t xml:space="preserve"> los pagos sólo serán válidos y liberatorios si se realizan a la cuenta bancaria a nombre de G&amp;R TAX-LEGAL CONSULTING, S.C. señalada en el Anexo B. El Prestador nunca solicitará pagos a cuentas personales ni de terceros; cualquier solicitud en ese sentido, o de cambio de cuenta, deberá considerarse fraudulenta y el Cliente deberá confirmarla previamente por los Canales Autorizados. Los pagos hechos a una cuenta distinta no liberarán al Cliente de su obligación de pago.</w:t>
       </w:r>
     </w:p>
     <w:p>
@@ -2528,7 +2528,7 @@
               <w:rPr>
                 <w:sz w:val="20"/>
               </w:rPr>
-              <w:t>[__________]</w:t>
+              <w:t>+52 55 7914 2013 y +52 55 3913 6467</w:t>
             </w:r>
           </w:p>
         </w:tc>
@@ -2933,14 +2933,7 @@
             </w:r>
             <w:r>
               <w:rPr/>
-              <w:t>[__________]</w:t>
-            </w:r>
-            <w:r>
-              <w:br/>
-            </w:r>
-            <w:r>
-              <w:rPr/>
-              <w:t>(G&amp;R TAX-LEGAL CONSULTING)</w:t>
+              <w:t>G&amp;R TAX-LEGAL CONSULTING, S.C.</w:t>
             </w:r>
             <w:r>
               <w:br/>
@@ -3015,9 +3008,7 @@
     </w:tbl>
     <w:p/>
     <w:p>
-      <w:r>
-        <w:br w:type="page"/>
-      </w:r>
+      <w:r/>
     </w:p>
     <w:p>
       <w:pPr>
@@ -3487,9 +3478,7 @@
       </w:r>
     </w:p>
     <w:p>
-      <w:r>
-        <w:br w:type="page"/>
-      </w:r>
+      <w:r/>
     </w:p>
     <w:p>
       <w:pPr>
@@ -4529,7 +4518,7 @@
       </w:pPr>
       <w:r>
         <w:rPr/>
-        <w:t>Los datos bancarios se comunicarán exclusivamente por escrito desde taxgr.interno@gmail.com (Cláusula 8.4). Banco: BBVA · Titular: G&amp;R Tax-Legal Consulting, S.C. · Tipo: Cuenta de cheques · CLABE: 012180001153583297 · Número de cuenta: 0115358329.</w:t>
+        <w:t>Los datos bancarios se comunicarán exclusivamente por escrito desde taxgr.interno@gmail.com (Cláusula 8.4). Banco: BBVA · Titular: G&amp;R TAX-LEGAL CONSULTING, S.C. · Tipo: Cuenta de cheques · CLABE: 012180001153583297 · Número de cuenta: 0115358329.</w:t>
       </w:r>
     </w:p>
     <w:p>
@@ -4540,13 +4529,11 @@
         <w:rPr>
           <w:i/>
         </w:rPr>
-        <w:t>Pagos válidos únicamente a esta cuenta a nombre de G&amp;R Tax-Legal Consulting, S.C. El Prestador nunca solicita pagos a cuentas personales o de terceros (Cláusula 8.4).</w:t>
+        <w:t>Pagos válidos únicamente a esta cuenta a nombre de G&amp;R TAX-LEGAL CONSULTING, S.C. El Prestador nunca solicita pagos a cuentas personales o de terceros (Cláusula 8.4).</w:t>
       </w:r>
     </w:p>
     <w:p>
-      <w:r>
-        <w:br w:type="page"/>
-      </w:r>
+      <w:r/>
     </w:p>
     <w:p>
       <w:pPr>

</xml_diff>

<commit_message>
Contrato: representante legal del Prestador
</commit_message>
<xml_diff>
--- a/gr-tax-legal-presentacion/docs/contrato.docx
+++ b/gr-tax-legal-presentacion/docs/contrato.docx
@@ -87,7 +87,7 @@
         <w:rPr>
           <w:b/>
         </w:rPr>
-        <w:t>[__________]</w:t>
+        <w:t>JUAN PABLO GARDUÑO VILCHIS</w:t>
       </w:r>
       <w:r>
         <w:rPr/>
@@ -97,7 +97,7 @@
         <w:rPr>
           <w:b/>
         </w:rPr>
-        <w:t>[__________]</w:t>
+        <w:t>Representante legal</w:t>
       </w:r>
       <w:r>
         <w:rPr/>
@@ -275,7 +275,7 @@
       </w:r>
       <w:r>
         <w:rPr/>
-        <w:t>Su representante cuenta con las facultades suficientes para celebrar el presente Contrato, mismas que no le han sido revocadas ni limitadas en forma alguna.</w:t>
+        <w:t>Su representante legal, JUAN PABLO GARDUÑO VILCHIS, cuenta con las facultades suficientes para celebrar el presente Contrato, según consta en [__________], mismas que no le han sido revocadas ni limitadas en forma alguna.</w:t>
       </w:r>
     </w:p>
     <w:p>
@@ -2940,14 +2940,14 @@
             </w:r>
             <w:r>
               <w:rPr/>
-              <w:t>Por: [__________]</w:t>
+              <w:t>Por: JUAN PABLO GARDUÑO VILCHIS</w:t>
             </w:r>
             <w:r>
               <w:br/>
             </w:r>
             <w:r>
               <w:rPr/>
-              <w:t>Cargo: [__________]</w:t>
+              <w:t>Cargo: Representante legal</w:t>
             </w:r>
           </w:p>
         </w:tc>

</xml_diff>

<commit_message>
Proceso: notarización/apostilla en China a cargo del cliente; G&R coordina perito
</commit_message>
<xml_diff>
--- a/gr-tax-legal-presentacion/docs/contrato.docx
+++ b/gr-tax-legal-presentacion/docs/contrato.docx
@@ -952,7 +952,7 @@
       </w:r>
       <w:r>
         <w:rPr/>
-        <w:t>: la protocolización o formalización notarial del Poder, su apostilla o legalización, su traducción por perito traductor, la inscripción del Cliente en el RFC, la obtención de la e.firma y la obtención de la CSF.</w:t>
+        <w:t>: la protocolización del Poder ante notario público mexicano, en su caso; la traducción al español por perito traductor autorizado de los documentos que el Cliente entregue; la inscripción del Cliente en el RFC, la obtención de la e.firma y la obtención de la CSF.</w:t>
       </w:r>
     </w:p>
     <w:p>
@@ -1060,7 +1060,7 @@
       </w:r>
       <w:r>
         <w:rPr/>
-        <w:t>La coordinación de la formalización notarial del Poder, su apostilla o legalización y su traducción por perito traductor, en términos de la Cláusula Cuarta.</w:t>
+        <w:t>La revisión previa del texto del Poder y de los documentos que el Cliente obtenga en su país de origen, y la coordinación de su traducción al español por perito traductor autorizado por el Poder Judicial de la Federación o por el Tribunal Superior de Justicia de la Ciudad de México, así como, en su caso, la protocolización del Poder ante notario público mexicano, en términos de la Cláusula Cuarta.</w:t>
       </w:r>
     </w:p>
     <w:p>
@@ -1244,7 +1244,7 @@
         <w:rPr>
           <w:b/>
         </w:rPr>
-        <w:t>CUARTA. Coordinación obligatoria de Trámites notariales, de apostilla y de traducción.</w:t>
+        <w:t>CUARTA. Documentos del país de origen y traducción por perito.</w:t>
       </w:r>
     </w:p>
     <w:p>
@@ -1253,17 +1253,7 @@
       </w:pPr>
       <w:r>
         <w:rPr/>
-        <w:t xml:space="preserve">4.1. La formalización notarial del Poder, su apostilla o legalización y su traducción por perito traductor deberán realizarse </w:t>
-      </w:r>
-      <w:r>
-        <w:rPr>
-          <w:b/>
-        </w:rPr>
-        <w:t>exclusivamente bajo la coordinación del Prestador</w:t>
-      </w:r>
-      <w:r>
-        <w:rPr/>
-        <w:t>, con el notario, la autoridad de apostilla, el perito traductor y los servicios de mensajería que el Prestador designe o apruebe por escrito. El Cliente no podrá realizar dichos Trámites por su cuenta ni a través de terceros no aprobados por el Prestador.</w:t>
+        <w:t>4.1. La firma del Poder ante notario público del país de origen, la emisión del Certificado Notarial, su apostilla o legalización y cualquier traducción realizada en el país de origen son responsabilidad exclusiva del Cliente, quien deberá gestionarlas y pagarlas directamente y entregarlas al Prestador ya concluidas. El Prestador proporcionará el texto del Poder y el modelo de Certificado Notarial y podrá revisar los borradores antes de su firma, pero no coordina, contrata ni responde por los notarios, autoridades de apostilla, traductores ni servicios de mensajería del país de origen.</w:t>
       </w:r>
     </w:p>
     <w:p>
@@ -1272,16 +1262,22 @@
       </w:pPr>
       <w:r>
         <w:rPr/>
-        <w:t>4.2. Lo anterior obedece a que el Prestador debe verificar que el Poder y su traducción cumplan con los requisitos de forma y contenido exigidos por la Autoridad, por lo que el Prestador no asume responsabilidad alguna por documentos preparados, formalizados, apostillados o traducidos sin su coordinación.</w:t>
+        <w:t>4.2. La traducción al español por perito traductor autorizado por el Poder Judicial de la Federación o por el Tribunal Superior de Justicia de la Ciudad de México y, en su caso, la protocolización del Poder ante notario público mexicano se realizarán exclusivamente con o a través del Prestador, con el perito y el notario que éste designe o apruebe por escrito. El Cliente no podrá contratar dichos servicios por su cuenta ni con terceros no aprobados por el Prestador, y el Prestador no asume responsabilidad por traducciones o protocolizaciones realizadas sin su intervención.</w:t>
       </w:r>
     </w:p>
     <w:p>
+      <w:pPr/>
+      <w:r>
+        <w:t>4.3. Si los documentos entregados por el Cliente llegan incompletos o presentan errores, omisiones, inconsistencias o apostilla o legalización defectuosa, no se ajustan al texto del Poder o al modelo proporcionado por el Prestador, o son observados o rechazados por el perito, el notario o la Autoridad: (a) los plazos a cargo del Prestador quedarán suspendidos hasta que el Cliente entregue los documentos corregidos; (b) el costo de rehacer, volver a apostillar, traducir, protocolizar o enviar los documentos, así como los Honorarios adicionales por el trabajo repetido, serán a cargo del Cliente; y (c) si el Cliente no los corrige, el Prestador podrá dar por terminado el Contrato conforme a la Cláusula Décima Cuarta, sin responsabilidad para el Prestador.</w:t>
+      </w:r>
+    </w:p>
+    <w:p>
       <w:pPr>
         <w:jc w:val="both"/>
       </w:pPr>
       <w:r>
         <w:rPr/>
-        <w:t>4.3. Si el Cliente incumple lo dispuesto en esta Cláusula, el Prestador podrá, a su elección: (a) rechazar los documentos y exigir que los Trámites se repitan bajo su coordinación, con cargo íntegro al Cliente; o (b) dar por terminado el Contrato conforme a la Cláusula Décima Cuarta, sin responsabilidad para el Prestador. En ningún caso el Prestador será responsable por rechazos, retrasos o costos derivados de dicho incumplimiento.</w:t>
+        <w:t>4.4. El Prestador no será responsable por retrasos, costos, rechazos ni cualquier otra consecuencia derivada de los trámites realizados en el país de origen, incluidos los tiempos de notarios, autoridades de apostilla, traductores, autoridades extranjeras y mensajería internacional.</w:t>
       </w:r>
     </w:p>
     <w:p>
@@ -1839,7 +1835,7 @@
       </w:r>
       <w:r>
         <w:rPr/>
-        <w:t xml:space="preserve"> Los Honorarios correspondientes a trabajo ya realizado no serán reembolsables. El Cliente reconoce que el pago a la firma retribuye trabajo profesional que comienza de inmediato (revisión documental, identificación del Cliente, preparación del Poder y coordinación con terceros), por lo que dicho pago se considera devengado al iniciar los Servicios, salvo lo previsto en la Cláusula 14.4.</w:t>
+        <w:t xml:space="preserve"> Los Honorarios correspondientes a trabajo ya realizado no serán reembolsables. El Cliente reconoce que el pago a la firma retribuye trabajo profesional que comienza de inmediato (revisión documental, identificación del Cliente, preparación del Poder, revisión de documentos y coordinación de la traducción por perito), por lo que dicho pago se considera devengado al iniciar los Servicios, salvo lo previsto en la Cláusula 14.4.</w:t>
       </w:r>
     </w:p>
     <w:p>
@@ -3215,7 +3211,7 @@
               <w:rPr>
                 <w:sz w:val="20"/>
               </w:rPr>
-              <w:t>Proporcionar o aprobar el texto del Poder; coordinar su formalización notarial, apostilla o legalización y traducción por perito traductor, con los terceros que designe el Prestador.</w:t>
+              <w:t>Proporcionar el texto del Poder y el modelo de Certificado Notarial; revisar los documentos del país de origen que entregue el Cliente; coordinar su traducción al español por perito traductor autorizado y, en su caso, la protocolización del Poder ante notario mexicano.</w:t>
             </w:r>
           </w:p>
         </w:tc>
@@ -3228,7 +3224,7 @@
               <w:rPr>
                 <w:sz w:val="20"/>
               </w:rPr>
-              <w:t>Pago del 100% de los Gastos de Terceros estimados; firma del Poder y, en su caso, comparecencia.</w:t>
+              <w:t>Entrega de los documentos firmados ante notario del país de origen, apostillados y, en su caso, con su traducción del país de origen (a cargo y costo del Cliente); pago del 100% de los Gastos de Terceros en México.</w:t>
             </w:r>
           </w:p>
         </w:tc>
@@ -3241,7 +3237,7 @@
               <w:rPr>
                 <w:sz w:val="20"/>
               </w:rPr>
-              <w:t>Poder formalizado, apostillado y traducido (copia digital; original en resguardo del Prestador mientras dure el Trámite).</w:t>
+              <w:t>Traducción por perito y, en su caso, Poder protocolizado (copia digital; original en resguardo del Prestador mientras dure el Trámite).</w:t>
             </w:r>
           </w:p>
         </w:tc>
@@ -3982,7 +3978,7 @@
               <w:rPr>
                 <w:sz w:val="20"/>
               </w:rPr>
-              <w:t>Honorarios y derechos notariales (formalización del Poder)</w:t>
+              <w:t>Protocolización del Poder ante notario público mexicano (en su caso)</w:t>
             </w:r>
           </w:p>
         </w:tc>
@@ -4036,7 +4032,7 @@
               <w:rPr>
                 <w:sz w:val="20"/>
               </w:rPr>
-              <w:t>Apostilla o legalización</w:t>
+              <w:t>Apostilla o legalización en el país de origen: a cargo y pago directo del Cliente (no incluido)</w:t>
             </w:r>
           </w:p>
         </w:tc>
@@ -4090,7 +4086,7 @@
               <w:rPr>
                 <w:sz w:val="20"/>
               </w:rPr>
-              <w:t>Traducción por perito traductor</w:t>
+              <w:t>Traducción al español por perito traductor autorizado (México)</w:t>
             </w:r>
           </w:p>
         </w:tc>
@@ -5169,7 +5165,7 @@
               <w:rPr>
                 <w:sz w:val="20"/>
               </w:rPr>
-              <w:t>Original, formalizado bajo coordinación del Prestador</w:t>
+              <w:t>Original, firmado ante notario del país de origen y apostillado (a cargo del Cliente)</w:t>
             </w:r>
           </w:p>
         </w:tc>
@@ -5316,7 +5312,7 @@
           <w:i/>
           <w:sz w:val="20"/>
         </w:rPr>
-        <w:t>Los documentos públicos extranjeros deberán apostillarse (o legalizarse, según corresponda) y traducirse al español por perito traductor, en todos los casos bajo la coordinación del Prestador (Cláusula Cuarta).</w:t>
+        <w:t>Los documentos públicos extranjeros deberán entregarse ya firmados ante notario, apostillados (o legalizados) y, en su caso, con su traducción realizada en el país de origen, a cargo y costo del Cliente. La traducción al español por perito traductor autorizado en México se realiza con o a través del Prestador (Cláusula Cuarta).</w:t>
       </w:r>
     </w:p>
     <w:tbl>

</xml_diff>

<commit_message>
Contrato: sin referencias a Mercado Libre ni uso del RFC
</commit_message>
<xml_diff>
--- a/gr-tax-legal-presentacion/docs/contrato.docx
+++ b/gr-tax-legal-presentacion/docs/contrato.docx
@@ -425,7 +425,7 @@
       </w:r>
       <w:r>
         <w:rPr/>
-        <w:t>Realiza o pretende realizar la venta de bienes a través de la plataforma Mercado Libre en los Estados Unidos Mexicanos y requiere obtener su inscripción en el Registro Federal de Contribuyentes ante el Servicio de Administración Tributaria.</w:t>
+        <w:t>Toda la información y documentación que ha proporcionado y proporcione al Prestador es verdadera, completa, auténtica y vigente, y los recursos con los que pagará los Servicios y los Gastos de Terceros proceden de fuentes lícitas.</w:t>
       </w:r>
     </w:p>
     <w:p>
@@ -435,20 +435,6 @@
       </w:pPr>
       <w:r>
         <w:t>d)</w:t>
-        <w:tab/>
-      </w:r>
-      <w:r>
-        <w:rPr/>
-        <w:t>Toda la información y documentación que ha proporcionado y proporcione al Prestador es verdadera, completa, auténtica y vigente, y los recursos con los que pagará los Servicios y los Gastos de Terceros proceden de fuentes lícitas.</w:t>
-      </w:r>
-    </w:p>
-    <w:p>
-      <w:pPr>
-        <w:ind w:left="567" w:hanging="340"/>
-        <w:jc w:val="both"/>
-      </w:pPr>
-      <w:r>
-        <w:t>e)</w:t>
         <w:tab/>
       </w:r>
       <w:r>
@@ -1152,7 +1138,7 @@
       </w:r>
       <w:r>
         <w:rPr/>
-        <w:t>Cualquier asunto relacionado con la cuenta del Cliente en Mercado Libre o cualquier otra plataforma digital, incluyendo su apertura, verificación, configuración fiscal, retenciones, bloqueos, suspensiones, reclamaciones, publicaciones o pagos;</w:t>
+        <w:t>Cualquier asunto relacionado con el uso que el Cliente dé al RFC, a la e.firma o a la CSF, el cual es decisión y responsabilidad exclusiva del Cliente, así como con cuentas del Cliente en plataformas digitales, comercios electrónicos o instituciones financieras;</w:t>
       </w:r>
     </w:p>
     <w:p>
@@ -1994,7 +1980,7 @@
       </w:pPr>
       <w:r>
         <w:rPr/>
-        <w:t>11.2. En ningún caso el Prestador será responsable por daños indirectos, consecuenciales, punitivos, lucro cesante, pérdida de ventas, de ingresos, de oportunidades de negocio, de clientes, de reputación, ni por bloqueos, suspensiones o retenciones en la cuenta de Mercado Libre del Cliente o en cualquier otra plataforma.</w:t>
+        <w:t>11.2. En ningún caso el Prestador será responsable por daños indirectos, consecuenciales, punitivos, lucro cesante, pérdida de ventas, de ingresos, de oportunidades de negocio, de clientes, de reputación, ni por el uso que el Cliente o terceros den al RFC, a la e.firma o a la CSF, ni por bloqueos, suspensiones o retenciones en cualquier cuenta o plataforma del Cliente.</w:t>
       </w:r>
     </w:p>
     <w:p>
@@ -5098,60 +5084,6 @@
               <w:rPr>
                 <w:sz w:val="20"/>
               </w:rPr>
-              <w:t>Descripción de la actividad económica en México (ventas a través de Mercado Libre) y, en su caso, información de la cuenta de vendedor que el SAT requiera.</w:t>
-            </w:r>
-          </w:p>
-        </w:tc>
-        <w:tc>
-          <w:tcPr>
-            <w:tcW w:type="dxa" w:w="2353"/>
-          </w:tcPr>
-          <w:p>
-            <w:r>
-              <w:rPr>
-                <w:sz w:val="20"/>
-              </w:rPr>
-              <w:t>Por escrito</w:t>
-            </w:r>
-          </w:p>
-        </w:tc>
-        <w:tc>
-          <w:tcPr>
-            <w:tcW w:type="dxa" w:w="2353"/>
-          </w:tcPr>
-          <w:p>
-            <w:r>
-              <w:rPr>
-                <w:sz w:val="20"/>
-              </w:rPr>
-              <w:t>☐</w:t>
-            </w:r>
-          </w:p>
-        </w:tc>
-      </w:tr>
-      <w:tr>
-        <w:tc>
-          <w:tcPr>
-            <w:tcW w:type="dxa" w:w="2353"/>
-          </w:tcPr>
-          <w:p>
-            <w:r>
-              <w:rPr>
-                <w:sz w:val="20"/>
-              </w:rPr>
-              <w:t>10</w:t>
-            </w:r>
-          </w:p>
-        </w:tc>
-        <w:tc>
-          <w:tcPr>
-            <w:tcW w:type="dxa" w:w="2353"/>
-          </w:tcPr>
-          <w:p>
-            <w:r>
-              <w:rPr>
-                <w:sz w:val="20"/>
-              </w:rPr>
               <w:t>Poder firmado en el texto proporcionado o aprobado por el Prestador, junto con el Certificado Notarial conforme al modelo del Prestador.</w:t>
             </w:r>
           </w:p>
@@ -5193,7 +5125,7 @@
               <w:rPr>
                 <w:sz w:val="20"/>
               </w:rPr>
-              <w:t>11</w:t>
+              <w:t>10</w:t>
             </w:r>
           </w:p>
         </w:tc>
@@ -5247,7 +5179,7 @@
               <w:rPr>
                 <w:sz w:val="20"/>
               </w:rPr>
-              <w:t>12</w:t>
+              <w:t>11</w:t>
             </w:r>
           </w:p>
         </w:tc>

</xml_diff>

<commit_message>
Contrato: 9.4 domicilio fiscal del Cliente
</commit_message>
<xml_diff>
--- a/gr-tax-legal-presentacion/docs/contrato.docx
+++ b/gr-tax-legal-presentacion/docs/contrato.docx
@@ -1862,6 +1862,24 @@
       <w:r>
         <w:rPr/>
         <w:t>9.3. El Prestador no asume obligación alguna como representante legal, retenedor, responsable solidario, domicilio fiscal ni representante del Cliente ante la Autoridad para efectos distintos de los Trámites, salvo pacto expreso por escrito. Al concluir los Servicios o terminar el Contrato, el Cliente podrá revocar el Poder; los apoderados designados por el Prestador podrán renunciar al mismo y el Prestador no tendrá obligación de realizar acto adicional alguno con base en él.</w:t>
+      </w:r>
+    </w:p>
+    <w:p>
+      <w:pPr>
+        <w:jc w:val="both"/>
+      </w:pPr>
+      <w:r>
+        <w:rPr/>
+        <w:t xml:space="preserve">9.4. </w:t>
+      </w:r>
+      <w:r>
+        <w:rPr>
+          <w:b/>
+        </w:rPr>
+        <w:t>Domicilio fiscal del Cliente.</w:t>
+      </w:r>
+      <w:r>
+        <w:t xml:space="preserve"> Una vez inscrito el Cliente en el RFC con el domicilio fiscal manifestado, el Cliente será el único responsable de mantenerlo existente, accesible y localizable para las visitas, verificaciones y notificaciones del SAT; de presentar el aviso de cambio de domicilio fiscal dentro del plazo legal ante cualquier modificación, en términos del artículo 27 del Código Fiscal de la Federación y de los artículos 29 y 30 de su Reglamento; y de atender oportunamente los requerimientos y notificaciones que el SAT realice en dicho domicilio. El Prestador no será responsable por las consecuencias derivadas de no mantener o no actualizar el domicilio fiscal, incluyendo, de manera enunciativa mas no limitativa, la condición de “no localizado”, la restricción temporal o cancelación de certificados de sello digital (CSD), la suspensión o restricción en el RFC, multas, recargos o cualquier otra sanción. Cualquier actualización, aviso o aclaración posterior ante el SAT constituirá un nuevo servicio, que se cotizará y contratará por separado.</w:t>
       </w:r>
     </w:p>
     <w:p>

</xml_diff>

<commit_message>
Contrato: domicilio fiscal incluido para trámites; servicio mensual aparte
</commit_message>
<xml_diff>
--- a/gr-tax-legal-presentacion/docs/contrato.docx
+++ b/gr-tax-legal-presentacion/docs/contrato.docx
@@ -938,7 +938,7 @@
       </w:r>
       <w:r>
         <w:rPr/>
-        <w:t>: la protocolización del Poder ante notario público mexicano, en su caso; la traducción al español por perito traductor autorizado de los documentos que el Cliente entregue; la inscripción del Cliente en el RFC, la obtención de la e.firma y la obtención de la CSF.</w:t>
+        <w:t>: la protocolización del Poder ante notario público mexicano, en su caso; la traducción al español por perito traductor autorizado de los documentos que el Cliente entregue; la provisión o facilitación de un domicilio fiscal para la inscripción en el RFC conforme a la Cláusula 9.4; la inscripción del Cliente en el RFC, la obtención de la e.firma y la obtención de la CSF.</w:t>
       </w:r>
     </w:p>
     <w:p>
@@ -1032,7 +1032,7 @@
       </w:r>
       <w:r>
         <w:rPr/>
-        <w:t>La obtención y Entrega de la Constancia de Situación Fiscal del Cliente; y</w:t>
+        <w:t>La obtención y Entrega de la Constancia de Situación Fiscal del Cliente;</w:t>
       </w:r>
     </w:p>
     <w:p>
@@ -1046,7 +1046,21 @@
       </w:r>
       <w:r>
         <w:rPr/>
-        <w:t>La revisión previa del texto del Poder y de los documentos que el Cliente obtenga en su país de origen, y la coordinación de su traducción al español por perito traductor autorizado por el Poder Judicial de la Federación o por el Tribunal Superior de Justicia de la Ciudad de México, así como, en su caso, la protocolización del Poder ante notario público mexicano, en términos de la Cláusula Cuarta.</w:t>
+        <w:t>La revisión previa del texto del Poder y de los documentos que el Cliente obtenga en su país de origen, y la coordinación de su traducción al español por perito traductor autorizado por el Poder Judicial de la Federación o por el Tribunal Superior de Justicia de la Ciudad de México, así como, en su caso, la protocolización del Poder ante notario público mexicano, en términos de la Cláusula Cuarta; y</w:t>
+      </w:r>
+    </w:p>
+    <w:p>
+      <w:pPr>
+        <w:ind w:left="567" w:hanging="340"/>
+        <w:jc w:val="both"/>
+      </w:pPr>
+      <w:r>
+        <w:t>e)</w:t>
+        <w:tab/>
+      </w:r>
+      <w:r>
+        <w:rPr/>
+        <w:t>La provisión o facilitación, por parte del Prestador, de un domicilio fiscal en México para efectos de la inscripción del Cliente en el RFC y la obtención de la e.firma, exclusivamente durante el periodo y en los términos previstos en la Cláusula 9.4.</w:t>
       </w:r>
     </w:p>
     <w:p>
@@ -1194,7 +1208,7 @@
       </w:r>
       <w:r>
         <w:rPr/>
-        <w:t>Cualquier opinión o planeación fiscal, así como la apertura de cuentas bancarias o la obtención de un domicilio fiscal en México; y</w:t>
+        <w:t>Cualquier opinión o planeación fiscal, la apertura de cuentas bancarias, así como el servicio continuo o mensual de domicilio fiscal posterior a la conclusión de los Trámites, el cual se contratará por separado; y</w:t>
       </w:r>
     </w:p>
     <w:p>
@@ -1861,7 +1875,7 @@
       </w:pPr>
       <w:r>
         <w:rPr/>
-        <w:t>9.3. El Prestador no asume obligación alguna como representante legal, retenedor, responsable solidario, domicilio fiscal ni representante del Cliente ante la Autoridad para efectos distintos de los Trámites, salvo pacto expreso por escrito. Al concluir los Servicios o terminar el Contrato, el Cliente podrá revocar el Poder; los apoderados designados por el Prestador podrán renunciar al mismo y el Prestador no tendrá obligación de realizar acto adicional alguno con base en él.</w:t>
+        <w:t>9.3. El Prestador no asume obligación alguna como representante legal, retenedor, responsable solidario ni representante del Cliente ante la Autoridad para efectos distintos de los Trámites, salvo pacto expreso por escrito. Al concluir los Servicios o terminar el Contrato, el Cliente podrá revocar el Poder; los apoderados designados por el Prestador podrán renunciar al mismo y el Prestador no tendrá obligación de realizar acto adicional alguno con base en él. En materia de domicilio fiscal, el Prestador únicamente asume lo expresamente previsto en las Cláusulas 2.1(e) y 9.4.</w:t>
       </w:r>
     </w:p>
     <w:p>
@@ -1876,10 +1890,64 @@
         <w:rPr>
           <w:b/>
         </w:rPr>
-        <w:t>Domicilio fiscal del Cliente.</w:t>
-      </w:r>
-      <w:r>
-        <w:t xml:space="preserve"> Una vez inscrito el Cliente en el RFC con el domicilio fiscal manifestado, el Cliente será el único responsable de mantenerlo existente, accesible y localizable para las visitas, verificaciones y notificaciones del SAT; de presentar el aviso de cambio de domicilio fiscal dentro del plazo legal ante cualquier modificación, en términos del artículo 27 del Código Fiscal de la Federación y de los artículos 29 y 30 de su Reglamento; y de atender oportunamente los requerimientos y notificaciones que el SAT realice en dicho domicilio. El Prestador no será responsable por las consecuencias derivadas de no mantener o no actualizar el domicilio fiscal, incluyendo, de manera enunciativa mas no limitativa, la condición de “no localizado”, la restricción temporal o cancelación de certificados de sello digital (CSD), la suspensión o restricción en el RFC, multas, recargos o cualquier otra sanción. Cualquier actualización, aviso o aclaración posterior ante el SAT constituirá un nuevo servicio, que se cotizará y contratará por separado.</w:t>
+        <w:t>Domicilio fiscal para los Trámites.</w:t>
+      </w:r>
+      <w:r>
+        <w:t xml:space="preserve"> El domicilio fiscal que el Prestador proporcione o facilite conforme a la Cláusula 2.1(e) se otorga únicamente para efectos de la inscripción en el RFC y la obtención de la e.firma, y estará vigente sólo durante los Trámites y hasta [___] días naturales posteriores a la Entrega del RFC, la CSF y la e.firma (el “Periodo de Gracia”).</w:t>
+      </w:r>
+    </w:p>
+    <w:p>
+      <w:pPr>
+        <w:jc w:val="both"/>
+      </w:pPr>
+      <w:r>
+        <w:rPr/>
+        <w:t xml:space="preserve">9.5. </w:t>
+      </w:r>
+      <w:r>
+        <w:rPr>
+          <w:b/>
+        </w:rPr>
+        <w:t>Obligaciones del Cliente al concluir el Periodo de Gracia.</w:t>
+      </w:r>
+      <w:r>
+        <w:t xml:space="preserve"> Antes de que concluya el Periodo de Gracia, el Cliente deberá, a su elección: (a) contratar con el Prestador el servicio mensual de domicilio fiscal, mediante contrato y honorarios independientes de este Contrato; o (b) presentar ante el SAT el aviso de cambio de domicilio fiscal a un domicilio propio, en términos del artículo 27 del Código Fiscal de la Federación y de los artículos 29 y 30 de su Reglamento, y entregar al Prestador el acuse correspondiente.</w:t>
+      </w:r>
+    </w:p>
+    <w:p>
+      <w:pPr>
+        <w:jc w:val="both"/>
+      </w:pPr>
+      <w:r>
+        <w:rPr/>
+        <w:t xml:space="preserve">9.6. </w:t>
+      </w:r>
+      <w:r>
+        <w:rPr>
+          <w:b/>
+        </w:rPr>
+        <w:t>Consecuencias del incumplimiento.</w:t>
+      </w:r>
+      <w:r>
+        <w:t xml:space="preserve"> Si al concluir el Periodo de Gracia el Cliente no ha realizado ninguna de las opciones anteriores: (a) el Prestador podrá presentar el aviso de cambio de domicilio en nombre del Cliente, en la medida en que el Poder lo permita, o requerir al Cliente que lo presente de inmediato; (b) el Prestador podrá negarse a recibir visitas, verificaciones o notificaciones del SAT por cuenta del Cliente, limitándose, en su caso, a reenviarle por los Canales Autorizados los documentos que llegue a recibir; (c) el Prestador no será responsable por la condición de “no localizado”, la restricción temporal o cancelación de certificados de sello digital (CSD), la suspensión o restricción en el RFC, multas, recargos ni cualquier otra consecuencia; y (d) el Cliente indemnizará y sacará en paz y a salvo al Prestador de cualquier reclamación, sanción, costo o daño derivado de ello.</w:t>
+      </w:r>
+    </w:p>
+    <w:p>
+      <w:pPr>
+        <w:jc w:val="both"/>
+      </w:pPr>
+      <w:r>
+        <w:rPr/>
+        <w:t xml:space="preserve">9.7. </w:t>
+      </w:r>
+      <w:r>
+        <w:rPr>
+          <w:b/>
+        </w:rPr>
+        <w:t>Uso limitado del domicilio.</w:t>
+      </w:r>
+      <w:r>
+        <w:t xml:space="preserve"> Durante su vigencia, el domicilio proporcionado o facilitado por el Prestador sólo podrá utilizarse para fines fiscales. El Cliente no podrá utilizarlo para fines comerciales, almacenar inventario, recibir mercancía ni anunciarlo o presentarlo como su establecimiento o lugar de negocios. Cualquier actualización, aviso o aclaración posterior ante el SAT constituirá un nuevo servicio, que se cotizará y contratará por separado.</w:t>
       </w:r>
     </w:p>
     <w:p>
@@ -3620,6 +3688,60 @@
                 <w:sz w:val="20"/>
               </w:rPr>
               <w:t>[__________]</w:t>
+            </w:r>
+          </w:p>
+        </w:tc>
+        <w:tc>
+          <w:tcPr>
+            <w:tcW w:type="dxa" w:w="2353"/>
+          </w:tcPr>
+          <w:p>
+            <w:r>
+              <w:rPr>
+                <w:sz w:val="20"/>
+              </w:rPr>
+              <w:t>[__________]</w:t>
+            </w:r>
+          </w:p>
+        </w:tc>
+        <w:tc>
+          <w:tcPr>
+            <w:tcW w:type="dxa" w:w="2353"/>
+          </w:tcPr>
+          <w:p>
+            <w:r>
+              <w:rPr>
+                <w:sz w:val="20"/>
+              </w:rPr>
+              <w:t>[__________]</w:t>
+            </w:r>
+          </w:p>
+        </w:tc>
+      </w:tr>
+      <w:tr>
+        <w:tc>
+          <w:tcPr>
+            <w:tcW w:type="dxa" w:w="2353"/>
+          </w:tcPr>
+          <w:p>
+            <w:r>
+              <w:rPr>
+                <w:sz w:val="20"/>
+              </w:rPr>
+              <w:t>Domicilio fiscal mensual posterior al Periodo de Gracia (Cláusula 9.5) – servicio no incluido, se contrata por separado</w:t>
+            </w:r>
+          </w:p>
+        </w:tc>
+        <w:tc>
+          <w:tcPr>
+            <w:tcW w:type="dxa" w:w="2353"/>
+          </w:tcPr>
+          <w:p>
+            <w:r>
+              <w:rPr>
+                <w:sz w:val="20"/>
+              </w:rPr>
+              <w:t>$[__________] mensuales</w:t>
             </w:r>
           </w:p>
         </w:tc>

</xml_diff>

<commit_message>
Contrato: devolución parcial y responsabilidad equilibrada
</commit_message>
<xml_diff>
--- a/gr-tax-legal-presentacion/docs/contrato.docx
+++ b/gr-tax-legal-presentacion/docs/contrato.docx
@@ -1336,8 +1336,7 @@
         <w:jc w:val="both"/>
       </w:pPr>
       <w:r>
-        <w:rPr/>
-        <w:t>5.3. No constituirá incumplimiento del Prestador, ni dará lugar a devolución de Honorarios o Gastos de Terceros, ni a indemnización alguna: (a) el rechazo, requerimiento, prevención, suspensión o retraso de la Autoridad; (b) la falta de disponibilidad de citas; (c) fallas, cambios o mantenimiento de sistemas de la Autoridad; (d) cambios en la legislación, reglas, criterios o requisitos de la Autoridad; (e) el incumplimiento, retraso o error del Cliente o de terceros que no estén bajo la dirección del Prestador; ni (f) caso fortuito o fuerza mayor.</w:t>
+        <w:t>5.3. Sin perjuicio de lo previsto en las Cláusulas 5.5 y 8.8 a 8.12, no constituirá incumplimiento del Prestador ni dará lugar a indemnización, por tratarse de causas ajenas a su control: (a) el rechazo, requerimiento, prevención, suspensión o retraso de la Autoridad no imputable al Prestador; (b) la falta de disponibilidad de citas; (c) fallas, cambios o mantenimiento de sistemas de la Autoridad; (d) cambios en la legislación, reglas, criterios o requisitos de la Autoridad; (e) el incumplimiento, retraso o error del Cliente o de terceros que no estén bajo la dirección del Prestador; ni (f) caso fortuito o fuerza mayor.</w:t>
       </w:r>
     </w:p>
     <w:p>
@@ -1347,6 +1346,23 @@
       <w:r>
         <w:rPr/>
         <w:t>5.4. Si la Autoridad modifica sus requisitos o exige documentación o comparecencias adicionales, el Prestador lo notificará al Cliente, y los Gastos de Terceros adicionales correrán a cargo del Cliente. Si ello implica trabajo profesional adicional sustancial, las Partes acordarán por escrito los Honorarios adicionales; a falta de acuerdo, cualquiera de las Partes podrá terminar el Contrato conforme a la Cláusula Décima Cuarta.</w:t>
+      </w:r>
+    </w:p>
+    <w:p>
+      <w:pPr>
+        <w:jc w:val="both"/>
+      </w:pPr>
+      <w:r>
+        <w:t xml:space="preserve">5.5. </w:t>
+      </w:r>
+      <w:r>
+        <w:rPr>
+          <w:b/>
+        </w:rPr>
+        <w:t>Responsabilidad del Prestador por causas imputables.</w:t>
+      </w:r>
+      <w:r>
+        <w:t xml:space="preserve"> Si un rechazo, requerimiento, error u omisión es imputable a negligencia, error o falta de diligencia del Prestador o de su personal, el Prestador: (a) rehará, corregirá o volverá a presentar el trabajo afectado sin Honorarios adicionales, dentro de un plazo razonable; y (b) cubrirá los Gastos de Terceros adicionales que dicho error genere directamente. Si, aun así, el Trámite no pudiera concluirse por esa causa, el Cliente tendrá derecho a la devolución de los Honorarios pagados correspondientes a las etapas no concluidas, conforme a la Cláusula 8.11, sujeto al límite de la Cláusula 11.1.</w:t>
       </w:r>
     </w:p>
     <w:p>
@@ -1719,7 +1735,6 @@
         <w:jc w:val="both"/>
       </w:pPr>
       <w:r>
-        <w:rPr/>
         <w:t xml:space="preserve">8.3. </w:t>
       </w:r>
       <w:r>
@@ -1729,18 +1744,7 @@
         <w:t>No reembolso de Gastos Devengados.</w:t>
       </w:r>
       <w:r>
-        <w:rPr/>
-        <w:t xml:space="preserve"> Los Gastos Devengados </w:t>
-      </w:r>
-      <w:r>
-        <w:rPr>
-          <w:b/>
-        </w:rPr>
-        <w:t>no serán reembolsables</w:t>
-      </w:r>
-      <w:r>
-        <w:rPr/>
-        <w:t xml:space="preserve"> en ningún caso, incluyendo terminación anticipada, rechazo o retraso de la Autoridad o desistimiento del Cliente.</w:t>
+        <w:t xml:space="preserve"> Los Gastos Devengados, por haber sido ya pagados a terceros, no serán reembolsables, salvo cuando se hayan generado por causa imputable al Prestador (Cláusula 5.5). En todo caso, el Prestador entregará al Cliente los comprobantes de los Gastos de Terceros pagados.</w:t>
       </w:r>
     </w:p>
     <w:p>
@@ -1837,6 +1841,94 @@
         <w:rPr/>
         <w:t xml:space="preserve"> Los Honorarios correspondientes a trabajo ya realizado no serán reembolsables. El Cliente reconoce que el pago a la firma retribuye trabajo profesional que comienza de inmediato (revisión documental, identificación del Cliente, preparación del Poder, revisión de documentos y coordinación de la traducción por perito), por lo que dicho pago se considera devengado al iniciar los Servicios, salvo lo previsto en la Cláusula 14.4.</w:t>
       </w:r>
+      <w:r>
+        <w:t xml:space="preserve"> Lo anterior, sin perjuicio de lo previsto en las Cláusulas 5.5 y 8.8 a 8.12.</w:t>
+      </w:r>
+    </w:p>
+    <w:p>
+      <w:pPr>
+        <w:jc w:val="both"/>
+      </w:pPr>
+      <w:r>
+        <w:t xml:space="preserve">8.8. </w:t>
+      </w:r>
+      <w:r>
+        <w:rPr>
+          <w:b/>
+        </w:rPr>
+        <w:t>Devolución parcial.</w:t>
+      </w:r>
+      <w:r>
+        <w:t xml:space="preserve"> El Cliente tendrá derecho a una devolución parcial de los Honorarios en los siguientes supuestos, siempre que no concurra ninguna de las causas excluidas en la Cláusula 8.9: (a) cuando, con posterioridad a la firma del Contrato, se modifiquen las disposiciones, reglas o requisitos aplicables de manera que los Trámites resulten jurídica o materialmente imposibles; o (b) cuando la Autoridad emita una Negativa Definitiva respecto de la inscripción en el RFC o de la e.firma por causas no imputables al Prestador ni al Cliente.</w:t>
+      </w:r>
+    </w:p>
+    <w:p>
+      <w:pPr>
+        <w:jc w:val="both"/>
+      </w:pPr>
+      <w:r>
+        <w:t xml:space="preserve">8.9. </w:t>
+      </w:r>
+      <w:r>
+        <w:rPr>
+          <w:b/>
+        </w:rPr>
+        <w:t>Causas excluidas.</w:t>
+      </w:r>
+      <w:r>
+        <w:t xml:space="preserve"> No procederá la devolución cuando la negativa o imposibilidad derive, total o parcialmente, de: (a) documentación o información falsa, incompleta, inconsistente o defectuosa proporcionada por el Cliente; (b) antecedentes fiscales, legales o reputacionales del Cliente, de sus socios, representantes o beneficiarios controladores; (c) la falta de asistencia, firma, comparecencia o respuesta del Cliente o de su representante; (d) el incumplimiento de cualquier otra obligación del Cliente; o (e) la falta de pago.</w:t>
+      </w:r>
+    </w:p>
+    <w:p>
+      <w:pPr>
+        <w:jc w:val="both"/>
+      </w:pPr>
+      <w:r>
+        <w:t xml:space="preserve">8.10. </w:t>
+      </w:r>
+      <w:r>
+        <w:rPr>
+          <w:b/>
+        </w:rPr>
+        <w:t>Negativa Definitiva.</w:t>
+      </w:r>
+      <w:r>
+        <w:t xml:space="preserve"> Se entenderá por “Negativa Definitiva”: (a) la resolución formal y por escrito de la Autoridad que niegue el Trámite; o (b) el rechazo por escrito de la Autoridad después de que el Prestador haya realizado al menos [___] intentos razonables de presentación o subsanación.</w:t>
+      </w:r>
+    </w:p>
+    <w:p>
+      <w:pPr>
+        <w:jc w:val="both"/>
+      </w:pPr>
+      <w:r>
+        <w:t xml:space="preserve">8.11. </w:t>
+      </w:r>
+      <w:r>
+        <w:rPr>
+          <w:b/>
+        </w:rPr>
+        <w:t>Monto y forma de la devolución.</w:t>
+      </w:r>
+      <w:r>
+        <w:t xml:space="preserve"> En los supuestos de la Cláusula 8.8: (a) el Prestador conservará los Honorarios correspondientes a las etapas concluidas; (b) devolverá el [___]% de los Honorarios pagados correspondientes a las etapas no concluidas; (c) los Gastos de Terceros ya pagados no serán reembolsables, pero el Prestador entregará sus comprobantes y reembolsará los anticipos de Gastos de Terceros no devengados; y (d) la devolución se realizará dentro de los [___] Días Hábiles siguientes a la Negativa Definitiva o a que se acredite la imposibilidad, mediante transferencia a una cuenta bancaria a nombre del Cliente.</w:t>
+      </w:r>
+    </w:p>
+    <w:p>
+      <w:pPr>
+        <w:jc w:val="both"/>
+      </w:pPr>
+      <w:r>
+        <w:t xml:space="preserve">8.12. </w:t>
+      </w:r>
+      <w:r>
+        <w:rPr>
+          <w:b/>
+        </w:rPr>
+        <w:t>Nuevo intento sin costo.</w:t>
+      </w:r>
+      <w:r>
+        <w:t xml:space="preserve"> Antes de realizar la devolución, el Prestador podrá ofrecer por escrito al Cliente un nuevo intento del Trámite sin Honorarios adicionales, cuando sea razonablemente viable. Si el Cliente lo acepta, la devolución quedará sujeta al resultado del nuevo intento; si lo rechaza, procederá la devolución conforme a la Cláusula 8.11.</w:t>
+      </w:r>
     </w:p>
     <w:p>
       <w:pPr>
@@ -2046,18 +2138,16 @@
         <w:jc w:val="both"/>
       </w:pPr>
       <w:r>
-        <w:rPr/>
-        <w:t xml:space="preserve">11.1. La responsabilidad total y acumulada del Prestador derivada o relacionada con el presente Contrato, por cualquier causa, ya sea contractual o extracontractual, </w:t>
+        <w:t xml:space="preserve">11.1. </w:t>
       </w:r>
       <w:r>
         <w:rPr>
           <w:b/>
         </w:rPr>
-        <w:t>no excederá del monto de los Honorarios efectivamente pagados por el Cliente al Prestador por el Servicio específico que dio origen a la reclamación</w:t>
-      </w:r>
-      <w:r>
-        <w:rPr/>
-        <w:t>. En ningún caso dicho límite incluirá los Gastos de Terceros.</w:t>
+        <w:t>Límite de responsabilidad.</w:t>
+      </w:r>
+      <w:r>
+        <w:t xml:space="preserve"> El Prestador responderá frente al Cliente por los daños directos que le cause por su culpa o negligencia en la prestación de los Servicios. Conforme a la práctica profesional usual, la responsabilidad total y acumulada del Prestador derivada del presente Contrato no excederá del monto de los Honorarios efectivamente pagados por el Cliente por el Servicio que dio origen a la reclamación, sin incluir los Gastos de Terceros, y sin perjuicio de las obligaciones de corregir el trabajo (Cláusula 5.5) y de devolución (Cláusulas 8.8 a 8.12).</w:t>
       </w:r>
     </w:p>
     <w:p>
@@ -2065,8 +2155,7 @@
         <w:jc w:val="both"/>
       </w:pPr>
       <w:r>
-        <w:rPr/>
-        <w:t>11.2. En ningún caso el Prestador será responsable por daños indirectos, consecuenciales, punitivos, lucro cesante, pérdida de ventas, de ingresos, de oportunidades de negocio, de clientes, de reputación, ni por el uso que el Cliente o terceros den al RFC, a la e.firma o a la CSF, ni por bloqueos, suspensiones o retenciones en cualquier cuenta o plataforma del Cliente.</w:t>
+        <w:t>11.2. Salvo dolo o mala fe, el Prestador no será responsable por daños indirectos, consecuenciales o punitivos, lucro cesante, pérdida de ventas, ingresos, oportunidades de negocio, clientes o reputación, ni por el uso que el Cliente o terceros den al RFC, a la e.firma o a la CSF, ni por bloqueos, suspensiones o retenciones en cualquier cuenta o plataforma del Cliente.</w:t>
       </w:r>
     </w:p>
     <w:p>
@@ -2074,8 +2163,7 @@
         <w:jc w:val="both"/>
       </w:pPr>
       <w:r>
-        <w:rPr/>
-        <w:t>11.3. El Prestador no será responsable por los actos u omisiones de la Autoridad, notarios, autoridades de apostilla, peritos traductores, empresas de mensajería u otros terceros, ni por la información o documentos proporcionados por el Cliente.</w:t>
+        <w:t>11.3. El Prestador no será responsable por los actos u omisiones de la Autoridad ni de terceros que no estén bajo su dirección, ni por la información o documentos proporcionados por el Cliente. Respecto de los peritos traductores, notarios mexicanos y demás terceros que el Prestador designe, éste responderá por la diligencia en su selección y supervisión y gestionará la corrección de cualquier error sin Honorarios adicionales.</w:t>
       </w:r>
     </w:p>
     <w:p>
@@ -2083,8 +2171,7 @@
         <w:jc w:val="both"/>
       </w:pPr>
       <w:r>
-        <w:rPr/>
-        <w:t>11.4. Las limitaciones anteriores no aplicarán en caso de dolo o mala fe del Prestador declarados por resolución judicial firme, en la medida en que la ley no permita su limitación.</w:t>
+        <w:t>11.4. Las limitaciones anteriores no aplicarán en caso de dolo o mala fe del Prestador, ni en los demás casos en que la ley no permita su limitación.</w:t>
       </w:r>
     </w:p>
     <w:p>
@@ -2188,7 +2275,7 @@
       </w:r>
       <w:r>
         <w:rPr/>
-        <w:t xml:space="preserve"> El Prestador podrá dar por terminado el presente Contrato, sin responsabilidad, mediante aviso por escrito: (a) en los supuestos de las Cláusulas 4.3, 5.4 y 7.3; (b) si el Cliente no paga cualquier cantidad dentro de los diez (10) Días Hábiles siguientes a su vencimiento; (c) si el Cliente no entrega la documentación o información solicitada dentro de los treinta (30) días naturales siguientes a su solicitud; (d) si el Cliente instruye al Prestador a realizar actos contrarios a la ley, a la ética profesional o que excedan el Poder; o (e) por pérdida de confianza derivada de conducta del Cliente que ponga en riesgo la reputación o seguridad jurídica del Prestador.</w:t>
+        <w:t xml:space="preserve"> El Prestador podrá dar por terminado el presente Contrato, sin responsabilidad, mediante aviso por escrito: (a) en los supuestos de las Cláusulas 4.3, 5.4 y 7.3; (b) si el Cliente no paga cualquier cantidad dentro de los diez (10) Días Hábiles siguientes a su vencimiento; (c) si el Cliente no entrega la documentación o información solicitada dentro de los treinta (30) días naturales siguientes a su solicitud; (d) si el Cliente instruye al Prestador a realizar actos contrarios a la ley, a la ética profesional o que excedan el Poder; o (e) por conducta del Cliente, debidamente justificada y notificada por escrito, que ponga en riesgo la reputación o seguridad jurídica del Prestador.</w:t>
       </w:r>
     </w:p>
     <w:p>
@@ -2215,7 +2302,6 @@
         <w:jc w:val="both"/>
       </w:pPr>
       <w:r>
-        <w:rPr/>
         <w:t xml:space="preserve">14.4. </w:t>
       </w:r>
       <w:r>
@@ -2225,8 +2311,7 @@
         <w:t>Efectos de la terminación.</w:t>
       </w:r>
       <w:r>
-        <w:rPr/>
-        <w:t xml:space="preserve"> En cualquier caso de terminación o rescisión, salvo la rescisión por incumplimiento grave del Prestador: (a) el Cliente pagará los Honorarios correspondientes al trabajo realizado hasta la fecha de terminación, que en ningún caso serán inferiores al pago de la etapa a la firma, más los Gastos Devengados; (b) si los Trámites ya hubieran sido presentados ante la Autoridad, se entenderá devengada la totalidad de los Honorarios; (c) el Prestador reembolsará los Gastos de Terceros anticipados que no sean Gastos Devengados, previa compensación de cualquier adeudo del Cliente; y (d) el Prestador entregará al Cliente los documentos originales de éste que obren en su poder y los Entregables obtenidos, una vez cubiertas las cantidades adeudadas. En caso de rescisión por incumplimiento grave del Prestador, éste reembolsará los Honorarios pagados correspondientes al trabajo no realizado, sujeto a la Cláusula Décima Primera.</w:t>
+        <w:t xml:space="preserve"> En cualquier caso de terminación o rescisión, salvo la rescisión por incumplimiento del Prestador: (a) el Cliente pagará los Honorarios de las etapas concluidas y la parte proporcional del trabajo realizado en la etapa en curso, más los Gastos Devengados; (b) el Prestador reembolsará los anticipos de Gastos de Terceros no devengados y entregará los comprobantes de los devengados, previa compensación de cualquier adeudo del Cliente; y (c) el Prestador entregará al Cliente los documentos originales de éste que obren en su poder y los Entregables obtenidos, una vez cubiertas las cantidades adeudadas. En los supuestos de las Cláusulas 8.8 a 8.12 prevalecerán las reglas de devolución parcial ahí previstas. En caso de rescisión por incumplimiento del Prestador, éste reembolsará la totalidad de los Honorarios pagados correspondientes a las etapas no concluidas, sujeto a la Cláusula Décima Primera.</w:t>
       </w:r>
     </w:p>
     <w:p>
@@ -4654,6 +4739,168 @@
         <w:t>Pagos válidos únicamente a esta cuenta a nombre de G&amp;R TAX-LEGAL CONSULTING, S.C. El Prestador nunca solicita pagos a cuentas personales o de terceros (Cláusula 8.4).</w:t>
       </w:r>
     </w:p>
+    <w:p>
+      <w:pPr>
+        <w:keepNext/>
+        <w:spacing w:before="160"/>
+        <w:jc w:val="left"/>
+      </w:pPr>
+      <w:r>
+        <w:rPr>
+          <w:b/>
+        </w:rPr>
+        <w:t>6. Devolución parcial (Cláusulas 8.8 a 8.12)</w:t>
+      </w:r>
+    </w:p>
+    <w:tbl>
+      <w:tblPr>
+        <w:tblStyle w:val="TableGrid"/>
+        <w:tblW w:type="auto" w:w="0"/>
+        <w:tblLook w:firstColumn="1" w:firstRow="1" w:lastColumn="0" w:lastRow="0" w:noHBand="0" w:noVBand="1" w:val="04A0"/>
+      </w:tblPr>
+      <w:tblGrid>
+        <w:gridCol w:w="4706"/>
+        <w:gridCol w:w="4706"/>
+      </w:tblGrid>
+      <w:tr>
+        <w:tc>
+          <w:tcPr>
+            <w:tcW w:type="dxa" w:w="4706"/>
+          </w:tcPr>
+          <w:p>
+            <w:r>
+              <w:rPr>
+                <w:b/>
+              </w:rPr>
+              <w:t>Concepto</w:t>
+            </w:r>
+          </w:p>
+        </w:tc>
+        <w:tc>
+          <w:tcPr>
+            <w:tcW w:type="dxa" w:w="4706"/>
+          </w:tcPr>
+          <w:p>
+            <w:r>
+              <w:rPr>
+                <w:b/>
+              </w:rPr>
+              <w:t>Regla</w:t>
+            </w:r>
+          </w:p>
+        </w:tc>
+      </w:tr>
+      <w:tr>
+        <w:tc>
+          <w:tcPr>
+            <w:tcW w:type="dxa" w:w="4706"/>
+          </w:tcPr>
+          <w:p>
+            <w:r>
+              <w:t>Etapas concluidas</w:t>
+            </w:r>
+          </w:p>
+        </w:tc>
+        <w:tc>
+          <w:tcPr>
+            <w:tcW w:type="dxa" w:w="4706"/>
+          </w:tcPr>
+          <w:p>
+            <w:r>
+              <w:t>Honorarios no reembolsables</w:t>
+            </w:r>
+          </w:p>
+        </w:tc>
+      </w:tr>
+      <w:tr>
+        <w:tc>
+          <w:tcPr>
+            <w:tcW w:type="dxa" w:w="4706"/>
+          </w:tcPr>
+          <w:p>
+            <w:r>
+              <w:t>Etapas no concluidas (supuestos de la Cláusula 8.8)</w:t>
+            </w:r>
+          </w:p>
+        </w:tc>
+        <w:tc>
+          <w:tcPr>
+            <w:tcW w:type="dxa" w:w="4706"/>
+          </w:tcPr>
+          <w:p>
+            <w:r>
+              <w:t>Devolución del [___]% de los Honorarios pagados</w:t>
+            </w:r>
+          </w:p>
+        </w:tc>
+      </w:tr>
+      <w:tr>
+        <w:tc>
+          <w:tcPr>
+            <w:tcW w:type="dxa" w:w="4706"/>
+          </w:tcPr>
+          <w:p>
+            <w:r>
+              <w:t>Gastos de Terceros devengados</w:t>
+            </w:r>
+          </w:p>
+        </w:tc>
+        <w:tc>
+          <w:tcPr>
+            <w:tcW w:type="dxa" w:w="4706"/>
+          </w:tcPr>
+          <w:p>
+            <w:r>
+              <w:t>No reembolsables; se entregan comprobantes</w:t>
+            </w:r>
+          </w:p>
+        </w:tc>
+      </w:tr>
+      <w:tr>
+        <w:tc>
+          <w:tcPr>
+            <w:tcW w:type="dxa" w:w="4706"/>
+          </w:tcPr>
+          <w:p>
+            <w:r>
+              <w:t>Intentos previos a la Negativa Definitiva</w:t>
+            </w:r>
+          </w:p>
+        </w:tc>
+        <w:tc>
+          <w:tcPr>
+            <w:tcW w:type="dxa" w:w="4706"/>
+          </w:tcPr>
+          <w:p>
+            <w:r>
+              <w:t>[___]</w:t>
+            </w:r>
+          </w:p>
+        </w:tc>
+      </w:tr>
+      <w:tr>
+        <w:tc>
+          <w:tcPr>
+            <w:tcW w:type="dxa" w:w="4706"/>
+          </w:tcPr>
+          <w:p>
+            <w:r>
+              <w:t>Plazo de devolución</w:t>
+            </w:r>
+          </w:p>
+        </w:tc>
+        <w:tc>
+          <w:tcPr>
+            <w:tcW w:type="dxa" w:w="4706"/>
+          </w:tcPr>
+          <w:p>
+            <w:r>
+              <w:t>[___] Días Hábiles</w:t>
+            </w:r>
+          </w:p>
+        </w:tc>
+      </w:tr>
+    </w:tbl>
     <w:p>
       <w:r/>
     </w:p>

</xml_diff>

<commit_message>
Contrato: sin entrega de comprobantes de gastos de terceros
</commit_message>
<xml_diff>
--- a/gr-tax-legal-presentacion/docs/contrato.docx
+++ b/gr-tax-legal-presentacion/docs/contrato.docx
@@ -1744,7 +1744,7 @@
         <w:t>No reembolso de Gastos Devengados.</w:t>
       </w:r>
       <w:r>
-        <w:t xml:space="preserve"> Los Gastos Devengados, por haber sido ya pagados a terceros, no serán reembolsables, salvo cuando se hayan generado por causa imputable al Prestador (Cláusula 5.5). En todo caso, el Prestador entregará al Cliente los comprobantes de los Gastos de Terceros pagados.</w:t>
+        <w:t xml:space="preserve"> Los Gastos Devengados, por haber sido ya pagados a terceros, no serán reembolsables, salvo cuando se hayan generado por causa imputable al Prestador (Cláusula 5.5).</w:t>
       </w:r>
     </w:p>
     <w:p>
@@ -1910,7 +1910,7 @@
         <w:t>Monto y forma de la devolución.</w:t>
       </w:r>
       <w:r>
-        <w:t xml:space="preserve"> En los supuestos de la Cláusula 8.8: (a) el Prestador conservará los Honorarios correspondientes a las etapas concluidas; (b) devolverá el [___]% de los Honorarios pagados correspondientes a las etapas no concluidas; (c) los Gastos de Terceros ya pagados no serán reembolsables, pero el Prestador entregará sus comprobantes y reembolsará los anticipos de Gastos de Terceros no devengados; y (d) la devolución se realizará dentro de los [___] Días Hábiles siguientes a la Negativa Definitiva o a que se acredite la imposibilidad, mediante transferencia a una cuenta bancaria a nombre del Cliente.</w:t>
+        <w:t xml:space="preserve"> En los supuestos de la Cláusula 8.8: (a) el Prestador conservará los Honorarios correspondientes a las etapas concluidas; (b) devolverá el [___]% de los Honorarios pagados correspondientes a las etapas no concluidas; (c) los Gastos de Terceros ya pagados no serán reembolsables, y el Prestador reembolsará los anticipos de Gastos de Terceros no devengados; y (d) la devolución se realizará dentro de los [___] Días Hábiles siguientes a la Negativa Definitiva o a que se acredite la imposibilidad, mediante transferencia a una cuenta bancaria a nombre del Cliente.</w:t>
       </w:r>
     </w:p>
     <w:p>
@@ -2311,7 +2311,7 @@
         <w:t>Efectos de la terminación.</w:t>
       </w:r>
       <w:r>
-        <w:t xml:space="preserve"> En cualquier caso de terminación o rescisión, salvo la rescisión por incumplimiento del Prestador: (a) el Cliente pagará los Honorarios de las etapas concluidas y la parte proporcional del trabajo realizado en la etapa en curso, más los Gastos Devengados; (b) el Prestador reembolsará los anticipos de Gastos de Terceros no devengados y entregará los comprobantes de los devengados, previa compensación de cualquier adeudo del Cliente; y (c) el Prestador entregará al Cliente los documentos originales de éste que obren en su poder y los Entregables obtenidos, una vez cubiertas las cantidades adeudadas. En los supuestos de las Cláusulas 8.8 a 8.12 prevalecerán las reglas de devolución parcial ahí previstas. En caso de rescisión por incumplimiento del Prestador, éste reembolsará la totalidad de los Honorarios pagados correspondientes a las etapas no concluidas, sujeto a la Cláusula Décima Primera.</w:t>
+        <w:t xml:space="preserve"> En cualquier caso de terminación o rescisión, salvo la rescisión por incumplimiento del Prestador: (a) el Cliente pagará los Honorarios de las etapas concluidas y la parte proporcional del trabajo realizado en la etapa en curso, más los Gastos Devengados; (b) el Prestador reembolsará los anticipos de Gastos de Terceros no devengados, previa compensación de cualquier adeudo del Cliente; y (c) el Prestador entregará al Cliente los documentos originales de éste que obren en su poder y los Entregables obtenidos, una vez cubiertas las cantidades adeudadas. En los supuestos de las Cláusulas 8.8 a 8.12 prevalecerán las reglas de devolución parcial ahí previstas. En caso de rescisión por incumplimiento del Prestador, éste reembolsará la totalidad de los Honorarios pagados correspondientes a las etapas no concluidas, sujeto a la Cláusula Décima Primera.</w:t>
       </w:r>
     </w:p>
     <w:p>
@@ -4851,7 +4851,7 @@
           </w:tcPr>
           <w:p>
             <w:r>
-              <w:t>No reembolsables; se entregan comprobantes</w:t>
+              <w:t>No reembolsables</w:t>
             </w:r>
           </w:p>
         </w:tc>

</xml_diff>

<commit_message>
Honorarios más IVA: total con IVA 51,200
</commit_message>
<xml_diff>
--- a/gr-tax-legal-presentacion/docs/contrato.docx
+++ b/gr-tax-legal-presentacion/docs/contrato.docx
@@ -3785,7 +3785,7 @@
               <w:rPr>
                 <w:sz w:val="20"/>
               </w:rPr>
-              <w:t>Más IVA, en su caso (Cláusula 8.1)</w:t>
+              <w:t>Más IVA 16% (Cláusula 8.1)</w:t>
             </w:r>
           </w:p>
         </w:tc>
@@ -3798,7 +3798,7 @@
               <w:rPr>
                 <w:sz w:val="20"/>
               </w:rPr>
-              <w:t>$12,000.00 más IVA, en su caso</w:t>
+              <w:t>$12,000.00 más IVA</w:t>
             </w:r>
           </w:p>
         </w:tc>
@@ -3839,7 +3839,7 @@
               <w:rPr>
                 <w:sz w:val="20"/>
               </w:rPr>
-              <w:t>Más IVA, en su caso (Cláusula 8.1)</w:t>
+              <w:t>Más IVA 16% (Cláusula 8.1)</w:t>
             </w:r>
           </w:p>
         </w:tc>
@@ -3852,7 +3852,7 @@
               <w:rPr>
                 <w:sz w:val="20"/>
               </w:rPr>
-              <w:t>$13,000.00 más IVA, en su caso</w:t>
+              <w:t>$13,000.00 más IVA</w:t>
             </w:r>
           </w:p>
         </w:tc>
@@ -3893,7 +3893,7 @@
               <w:rPr>
                 <w:sz w:val="20"/>
               </w:rPr>
-              <w:t>Más IVA, en su caso (Cláusula 8.1)</w:t>
+              <w:t>$4,000.00</w:t>
             </w:r>
           </w:p>
         </w:tc>
@@ -3906,7 +3906,7 @@
               <w:rPr>
                 <w:sz w:val="20"/>
               </w:rPr>
-              <w:t>$25,000.00 más IVA, en su caso</w:t>
+              <w:t>$29,000.00</w:t>
             </w:r>
           </w:p>
         </w:tc>
@@ -4550,7 +4550,7 @@
           <w:i/>
           <w:sz w:val="20"/>
         </w:rPr>
-        <w:t>Total por empresa: Honorarios $25,000.00 + Gastos de Terceros estimados $22,200.00 = $47,200.00 MXN (los Honorarios, más IVA en su caso, conforme a la Cláusula 8.1). Los Gastos de Terceros son independientes de los Honorarios y pueden variar según la documentación y los costos aplicables, por causas ajenas al Prestador; cualquier diferencia se cubrirá conforme a la Cláusula 8.2.</w:t>
+        <w:t>Total por empresa: Honorarios $25,000.00 + Gastos de Terceros estimados $22,200.00 = $47,200.00 MXN, más IVA sobre Honorarios ($4,000.00); total con IVA: $51,200.00 MXN (Cláusula 8.1). Los Gastos de Terceros se cubren según lo cotizado por los terceros, sin que el Prestador les adicione IVA. Los Gastos de Terceros son independientes de los Honorarios y pueden variar según la documentación y los costos aplicables, por causas ajenas al Prestador; cualquier diferencia se cubrirá conforme a la Cláusula 8.2.</w:t>
       </w:r>
     </w:p>
     <w:p>

</xml_diff>

<commit_message>
QA final: deck placeholders, nav móvil, desglose sin cierre, contrato valores propuestos
</commit_message>
<xml_diff>
--- a/gr-tax-legal-presentacion/docs/contrato.docx
+++ b/gr-tax-legal-presentacion/docs/contrato.docx
@@ -80,7 +80,7 @@
       </w:r>
       <w:r>
         <w:rPr/>
-        <w:t>, en su carácter de Representante legal (el “</w:t>
+        <w:t>, en su carácter de Representante legal y socio principal (el “</w:t>
       </w:r>
       <w:r>
         <w:rPr>
@@ -178,7 +178,7 @@
         <w:rPr/>
         <w:t>b)</w:t>
         <w:tab/>
-        <w:t>Su representante legal, JUAN PABLO GARDUÑO VILCHIS, tiene facultades suficientes para celebrar este Contrato, según [__________], no revocadas ni limitadas.</w:t>
+        <w:t>Su representante legal y socio principal, JUAN PABLO GARDUÑO VILCHIS, tiene facultades suficientes para celebrar este Contrato, según [__________], no revocadas ni limitadas.</w:t>
       </w:r>
     </w:p>
     <w:p>
@@ -1337,7 +1337,7 @@
       </w:r>
       <w:r>
         <w:rPr/>
-        <w:t xml:space="preserve"> El Cliente pagará los Honorarios del Anexo B, que son fijos para el alcance del Anexo A. Los Honorarios no incluyen IVA. En caso de que el Cliente requiera factura (CFDI), se adicionará el 16% del Impuesto al Valor Agregado. Se pagan así: (a) [___]% a la firma del Contrato, como condición para iniciar los Servicios; y (b) [___]% a la Entrega del RFC, la e.firma y la CSF, o cuando el Prestador notifique que los Trámites fueron presentados y sólo están pendientes por causa imputable al Cliente, lo que ocurra primero.</w:t>
+        <w:t xml:space="preserve"> El Cliente pagará los Honorarios del Anexo B, que son fijos para el alcance del Anexo A. Los Honorarios no incluyen IVA. En caso de que el Cliente requiera factura (CFDI), se adicionará el 16% del Impuesto al Valor Agregado. Se pagan así: (a) cincuenta por ciento (50%) a la firma del Contrato, como condición para iniciar los Servicios; y (b) cincuenta por ciento (50%) a la Entrega del RFC, la e.firma y la CSF, o cuando el Prestador notifique que los Trámites fueron presentados y sólo están pendientes por causa imputable al Cliente, lo que ocurra primero.</w:t>
       </w:r>
     </w:p>
     <w:p>
@@ -1442,7 +1442,7 @@
       </w:r>
       <w:r>
         <w:rPr/>
-        <w:t xml:space="preserve"> Las cantidades vencidas causarán un interés moratorio de [___]% mensual. El Prestador podrá suspender los Servicios y retener los Entregables hasta el pago, con recorrido de los plazos por el tiempo de la suspensión.</w:t>
+        <w:t xml:space="preserve"> Las cantidades vencidas causarán un interés moratorio de uno punto cinco por ciento (1.5%) mensual sobre el saldo vencido. El Prestador podrá suspender los Servicios y retener los Entregables hasta el pago, con recorrido de los plazos por el tiempo de la suspensión.</w:t>
       </w:r>
     </w:p>
     <w:p>
@@ -1518,7 +1518,7 @@
       </w:r>
       <w:r>
         <w:rPr/>
-        <w:t xml:space="preserve"> Es: (a) la resolución escrita de la Autoridad que niega el Trámite; o (b) el rechazo escrito de la Autoridad tras [___] intentos de presentación o subsanación realizados por el Prestador.</w:t>
+        <w:t xml:space="preserve"> Es: (a) la resolución escrita de la Autoridad que niega el Trámite; o (b) el rechazo escrito de la Autoridad tras dos (2) intentos de presentación o subsanación realizados por el Prestador.</w:t>
       </w:r>
     </w:p>
     <w:p>
@@ -1537,7 +1537,7 @@
       </w:r>
       <w:r>
         <w:rPr/>
-        <w:t xml:space="preserve"> En los supuestos de la Cláusula 8.8: (a) el Prestador conserva los Honorarios de las etapas concluidas y devuelve el [___]% de los Honorarios pagados de las etapas no concluidas; (b) los Gastos Devengados no se reembolsan y los anticipos no devengados sí; y (c) la devolución se paga dentro de [___] Días Hábiles siguientes a la Negativa Definitiva o a la notificación escrita de la imposibilidad, por transferencia a una cuenta a nombre del Cliente.</w:t>
+        <w:t xml:space="preserve"> En los supuestos de la Cláusula 8.8: (a) el Prestador conserva los Honorarios de las etapas concluidas y devuelve el setenta por ciento (70%) de los Honorarios pagados de las etapas no concluidas; (b) los Gastos Devengados no se reembolsan y los anticipos no devengados sí; y (c) la devolución se paga dentro de quince (15) Días Hábiles siguientes a la Negativa Definitiva o a la notificación escrita de la imposibilidad, por transferencia a una cuenta a nombre del Cliente.</w:t>
       </w:r>
     </w:p>
     <w:p>
@@ -1621,7 +1621,7 @@
       </w:r>
       <w:r>
         <w:rPr/>
-        <w:t xml:space="preserve"> El domicilio fiscal proporcionado o facilitado conforme a la Cláusula 2.1(e) sirve sólo para la inscripción en el RFC y la obtención de la e.firma, y estará disponible hasta [___] días naturales posteriores a la Entrega del RFC, la CSF y la e.firma (el “</w:t>
+        <w:t xml:space="preserve"> El domicilio fiscal proporcionado o facilitado conforme a la Cláusula 2.1(e) sirve sólo para la inscripción en el RFC y la obtención de la e.firma, y estará disponible hasta seis (6) meses posteriores a la Entrega del RFC, la CSF y la e.firma (el “</w:t>
       </w:r>
       <w:r>
         <w:rPr>
@@ -2003,7 +2003,7 @@
       </w:pPr>
       <w:r>
         <w:rPr/>
-        <w:t>Durante la vigencia y los doce (12) meses siguientes, el Cliente, directamente o por interpósita persona, no contratará ni recibirá servicios de socios, empleados o colaboradores del Prestador que hayan intervenido en los Servicios. La pena convencional por incumplimiento es de [__________]. No hay incumplimiento si la contratación deriva de una convocatoria pública no dirigida al personal del Prestador.</w:t>
+        <w:t>Durante la vigencia y los doce (12) meses siguientes, el Cliente, directamente o por interpósita persona, no contratará ni recibirá servicios de socios, empleados o colaboradores del Prestador que hayan intervenido en los Servicios. La pena convencional por incumplimiento equivale a seis (6) meses del salario bruto de la persona contratada. No hay incumplimiento si la contratación deriva de una convocatoria pública no dirigida al personal del Prestador.</w:t>
       </w:r>
     </w:p>
     <w:p>
@@ -2239,7 +2239,7 @@
               <w:rPr>
                 <w:sz w:val="19"/>
               </w:rPr>
-              <w:t>[__________]</w:t>
+              <w:t>Juan Pablo Garduño Vilchis</w:t>
             </w:r>
           </w:p>
         </w:tc>
@@ -2530,7 +2530,7 @@
             </w:r>
             <w:r>
               <w:rPr/>
-              <w:t>Cargo: Representante legal</w:t>
+              <w:t>Cargo: Representante legal y socio principal</w:t>
             </w:r>
           </w:p>
         </w:tc>
@@ -3072,7 +3072,7 @@
       </w:r>
       <w:r>
         <w:rPr/>
-        <w:t xml:space="preserve"> hasta [___] respuestas a requerimientos o subsanaciones de la Autoridad durante los Trámites, no causados por la Información del Cliente. Las adicionales se cotizan conforme a la Cláusula 5.3.</w:t>
+        <w:t xml:space="preserve"> hasta dos (2) respuestas a requerimientos o subsanaciones de la Autoridad durante los Trámites, no causados por la Información del Cliente. Las adicionales se cotizan conforme a la Cláusula 5.3.</w:t>
       </w:r>
     </w:p>
     <w:p>
@@ -3486,7 +3486,7 @@
               <w:rPr>
                 <w:sz w:val="19"/>
               </w:rPr>
-              <w:t>[___]%</w:t>
+              <w:t>50%</w:t>
             </w:r>
           </w:p>
         </w:tc>
@@ -3499,7 +3499,7 @@
               <w:rPr>
                 <w:sz w:val="19"/>
               </w:rPr>
-              <w:t>[__________]</w:t>
+              <w:t>$12,500.00</w:t>
             </w:r>
           </w:p>
         </w:tc>
@@ -3540,7 +3540,7 @@
               <w:rPr>
                 <w:sz w:val="19"/>
               </w:rPr>
-              <w:t>[___]%</w:t>
+              <w:t>50%</w:t>
             </w:r>
           </w:p>
         </w:tc>
@@ -3553,7 +3553,7 @@
               <w:rPr>
                 <w:sz w:val="19"/>
               </w:rPr>
-              <w:t>[__________]</w:t>
+              <w:t>$12,500.00</w:t>
             </w:r>
           </w:p>
         </w:tc>
@@ -4055,7 +4055,7 @@
               <w:rPr>
                 <w:sz w:val="19"/>
               </w:rPr>
-              <w:t>[___]% del importe de esa etapa</w:t>
+              <w:t>50% del importe de esa etapa</w:t>
             </w:r>
           </w:p>
         </w:tc>
@@ -4070,7 +4070,7 @@
               <w:rPr>
                 <w:sz w:val="19"/>
               </w:rPr>
-              <w:t>Domicilio fiscal mensual posterior al Periodo de Gracia (Cláusula 9.5) — no incluido, contrato aparte</w:t>
+              <w:t>Domicilio fiscal mensual posterior al Periodo de Gracia de seis (6) meses (Cláusulas 9.4 y 9.5) — no incluido, contrato aparte</w:t>
             </w:r>
           </w:p>
         </w:tc>
@@ -4252,7 +4252,7 @@
               <w:rPr>
                 <w:sz w:val="19"/>
               </w:rPr>
-              <w:t>Devolución del [___]%</w:t>
+              <w:t>Devolución del 70%</w:t>
             </w:r>
           </w:p>
         </w:tc>
@@ -4336,7 +4336,7 @@
               <w:rPr>
                 <w:sz w:val="19"/>
               </w:rPr>
-              <w:t>[___]</w:t>
+              <w:t>Dos (2)</w:t>
             </w:r>
           </w:p>
         </w:tc>
@@ -4364,7 +4364,7 @@
               <w:rPr>
                 <w:sz w:val="19"/>
               </w:rPr>
-              <w:t>[___] Días Hábiles</w:t>
+              <w:t>15 Días Hábiles</w:t>
             </w:r>
           </w:p>
         </w:tc>

</xml_diff>

<commit_message>
Contrato: domicilio fiscal termina en la Entrega de la e.firma, sin periodo de gracia
</commit_message>
<xml_diff>
--- a/gr-tax-legal-presentacion/docs/contrato.docx
+++ b/gr-tax-legal-presentacion/docs/contrato.docx
@@ -738,11 +738,11 @@
         <w:rPr>
           <w:b/>
         </w:rPr>
-        <w:t>Periodo de Gracia</w:t>
+        <w:t>Poder</w:t>
       </w:r>
       <w:r>
         <w:rPr/>
-        <w:t>”: el definido en la Cláusula 9.4.</w:t>
+        <w:t>”: poder otorgado por el Cliente a las personas que designe el Prestador, en el texto proporcionado por éste.</w:t>
       </w:r>
     </w:p>
     <w:p>
@@ -761,11 +761,11 @@
         <w:rPr>
           <w:b/>
         </w:rPr>
-        <w:t>Poder</w:t>
+        <w:t>Servicios</w:t>
       </w:r>
       <w:r>
         <w:rPr/>
-        <w:t>”: poder otorgado por el Cliente a las personas que designe el Prestador, en el texto proporcionado por éste.</w:t>
+        <w:t>”: exclusivamente los de la Cláusula 2.1 y el Anexo A.</w:t>
       </w:r>
     </w:p>
     <w:p>
@@ -784,29 +784,6 @@
         <w:rPr>
           <w:b/>
         </w:rPr>
-        <w:t>Servicios</w:t>
-      </w:r>
-      <w:r>
-        <w:rPr/>
-        <w:t>”: exclusivamente los de la Cláusula 2.1 y el Anexo A.</w:t>
-      </w:r>
-    </w:p>
-    <w:p>
-      <w:pPr>
-        <w:spacing w:after="40"/>
-        <w:ind w:left="567" w:hanging="397"/>
-        <w:jc w:val="both"/>
-      </w:pPr>
-      <w:r>
-        <w:rPr/>
-        <w:t>20.</w:t>
-        <w:tab/>
-        <w:t>“</w:t>
-      </w:r>
-      <w:r>
-        <w:rPr>
-          <w:b/>
-        </w:rPr>
         <w:t>Trámites</w:t>
       </w:r>
       <w:r>
@@ -1045,7 +1022,7 @@
         <w:rPr/>
         <w:t>e)</w:t>
         <w:tab/>
-        <w:t>Planeación fiscal, apertura de cuentas bancarias y el servicio mensual de domicilio fiscal posterior al Periodo de Gracia; y</w:t>
+        <w:t>Planeación fiscal, apertura de cuentas bancarias y el servicio mensual de domicilio fiscal posterior a la Entrega de la e.firma; y</w:t>
       </w:r>
     </w:p>
     <w:p>
@@ -1621,17 +1598,17 @@
       </w:r>
       <w:r>
         <w:rPr/>
-        <w:t xml:space="preserve"> El domicilio fiscal proporcionado o facilitado conforme a la Cláusula 2.1(e) sirve sólo para la inscripción en el RFC y la obtención de la e.firma, y estará disponible hasta seis (6) meses posteriores a la Entrega del RFC, la CSF y la e.firma (el “</w:t>
+        <w:t xml:space="preserve"> El domicilio fiscal proporcionado o facilitado conforme a la Cláusula 2.1(e) sirve sólo para la inscripción en el RFC y la obtención de la e.firma, y concluye en la fecha de Entrega de la e.firma, que constará en el acta o acuse de entrega firmado por el Cliente (la “</w:t>
       </w:r>
       <w:r>
         <w:rPr>
           <w:b/>
         </w:rPr>
-        <w:t>Periodo de Gracia</w:t>
+        <w:t>Fecha de Entrega de la e.firma</w:t>
       </w:r>
       <w:r>
         <w:rPr/>
-        <w:t>”).</w:t>
+        <w:t>”). No hay periodo adicional.</w:t>
       </w:r>
     </w:p>
     <w:p>
@@ -1640,7 +1617,7 @@
       </w:pPr>
       <w:r>
         <w:rPr/>
-        <w:t>9.5. Antes de que concluya el Periodo de Gracia, el Cliente deberá: (a) contratar con el Prestador el servicio mensual de domicilio fiscal, por contrato y honorarios independientes (Anexo B); o (b) presentar ante el SAT el aviso de cambio de domicilio fiscal a un domicilio propio, conforme al artículo 27 del Código Fiscal de la Federación y los artículos 29 y 30 de su Reglamento, y enviar el acuse al Prestador.</w:t>
+        <w:t>9.5. A más tardar en la Fecha de Entrega de la e.firma, el Cliente deberá: (a) haber firmado con el Prestador el contrato del servicio mensual de domicilio fiscal, con honorarios independientes (Anexo B); o (b) presentar ante el SAT, en el mismo acto de entrega, el aviso de cambio de domicilio fiscal a un domicilio propio, conforme al artículo 27 del Código Fiscal de la Federación y los artículos 29 y 30 de su Reglamento, y entregar el acuse al Prestador. Para el inciso (b), el Cliente autoriza al Prestador a presentar el aviso en esa fecha con la facultad prevista en la sección 3 del Poder, al domicilio que el Cliente indique por escrito.</w:t>
       </w:r>
     </w:p>
     <w:p>
@@ -1649,7 +1626,7 @@
       </w:pPr>
       <w:r>
         <w:rPr/>
-        <w:t>9.6. Si al concluir el Periodo de Gracia el Cliente no cumplió la Cláusula 9.5: (a) el Prestador podrá presentar el aviso de cambio de domicilio fiscal en nombre del Cliente, en ejercicio de la facultad para presentar avisos de actualización al RFC prevista en la sección 3 del Poder, o requerirle que lo presente dentro de cinco (5) Días Hábiles; (b) el Prestador podrá negarse a atender visitas, verificaciones o notificaciones de la Autoridad dirigidas al Cliente, limitándose a reenviar por Canal Autorizado los documentos que reciba; (c) el Prestador no será responsable por la condición de “no localizado”, la restricción o cancelación de certificados de sello digital, la suspensión o restricción del RFC, multas o recargos; y (d) el Cliente indemnizará al Prestador por cualquier reclamación, sanción o costo derivado.</w:t>
+        <w:t>9.6. Si en la Fecha de Entrega de la e.firma el Cliente no cumplió la Cláusula 9.5, a partir de esa fecha: (a) el Prestador podrá presentar el aviso de cambio de domicilio fiscal en nombre del Cliente, en ejercicio de la facultad para presentar avisos de actualización al RFC prevista en la sección 3 del Poder, o requerirle que lo presente dentro de cinco (5) Días Hábiles; (b) el Prestador podrá negarse a atender visitas, verificaciones o notificaciones de la Autoridad dirigidas al Cliente, limitándose a reenviar por Canal Autorizado los documentos que reciba; (c) el Prestador no será responsable por la condición de “no localizado”, la restricción o cancelación de certificados de sello digital, la suspensión o restricción del RFC, multas o recargos; y (d) el Cliente indemnizará al Prestador por cualquier reclamación, sanción o costo derivado.</w:t>
       </w:r>
     </w:p>
     <w:p>
@@ -4070,7 +4047,7 @@
               <w:rPr>
                 <w:sz w:val="19"/>
               </w:rPr>
-              <w:t>Domicilio fiscal mensual posterior al Periodo de Gracia de seis (6) meses (Cláusulas 9.4 y 9.5) — no incluido, contrato aparte</w:t>
+              <w:t>Domicilio fiscal mensual posterior a la Entrega de la e.firma (Cláusulas 9.4 y 9.5) — no incluido, contrato aparte</w:t>
             </w:r>
           </w:p>
         </w:tc>

</xml_diff>

<commit_message>
G&R: nuevo calendario de pagos por etapa y datos SWIFT para transferencia internacional
</commit_message>
<xml_diff>
--- a/gr-tax-legal-presentacion/docs/contrato.docx
+++ b/gr-tax-legal-presentacion/docs/contrato.docx
@@ -1314,7 +1314,7 @@
       </w:r>
       <w:r>
         <w:rPr/>
-        <w:t xml:space="preserve"> El Cliente pagará los Honorarios del Anexo B, que son fijos para el alcance del Anexo A. Los Honorarios no incluyen IVA. En caso de que el Cliente requiera factura (CFDI), se adicionará el 16% del Impuesto al Valor Agregado. Se pagan así: (a) cincuenta por ciento (50%) a la firma del Contrato, como condición para iniciar los Servicios; y (b) cincuenta por ciento (50%) a la Entrega del RFC, la e.firma y la CSF, o cuando el Prestador notifique que los Trámites fueron presentados y sólo están pendientes por causa imputable al Cliente, lo que ocurra primero.</w:t>
+        <w:t xml:space="preserve"> El Cliente pagará los Honorarios del Anexo B, que son fijos para el alcance del Anexo A. Los Honorarios no incluyen IVA. En caso de que el Cliente requiera factura (CFDI), se adicionará el 16% del Impuesto al Valor Agregado. Se pagan por etapa, conforme al calendario del Anexo B: (a) etapa RFC: cincuenta por ciento (50%) a la firma del Contrato, como condición para iniciar los Servicios, y cincuenta por ciento (50%) a la Entrega del RFC y la CSF; y (b) etapa e.firma: cincuenta por ciento (50%) a la notificación escrita del Prestador del inicio de esa etapa, que no podrá ser anterior a la Entrega del RFC, como condición para iniciarla, y cincuenta por ciento (50%) a la Entrega de la e.firma. Si un Trámite fue presentado y sólo está pendiente por causa imputable al Cliente, el saldo de su etapa será exigible desde la notificación escrita del Prestador.</w:t>
       </w:r>
     </w:p>
     <w:p>
@@ -1333,7 +1333,7 @@
       </w:r>
       <w:r>
         <w:rPr/>
-        <w:t xml:space="preserve"> Se pagan al 100% por anticipado, antes de la gestión que los genere, conforme al Anexo B. El Prestador no los financia. Si el monto que cotice el tercero excede la estimación, el Cliente pagará la diferencia antes de la gestión. Los anticipos no devengados al terminar los Servicios se reembolsarán dentro de quince (15) Días Hábiles.</w:t>
+        <w:t xml:space="preserve"> Se pagan al 100% a la firma del Contrato, junto con el primer pago de Honorarios, conforme al Anexo B. El Prestador no los financia. Si el monto que cotice el tercero excede la estimación, el Cliente pagará la diferencia antes de la gestión. Al terminar los Servicios, el Prestador reembolsará dentro de quince (15) Días Hábiles únicamente los anticipos no devengados (montos no erogados ni comprometidos con el tercero).</w:t>
       </w:r>
     </w:p>
     <w:p>
@@ -1371,7 +1371,7 @@
       </w:r>
       <w:r>
         <w:rPr/>
-        <w:t xml:space="preserve"> Los pagos se harán en pesos mexicanos por transferencia, desde cuentas a nombre del Cliente, </w:t>
+        <w:t xml:space="preserve"> Los pagos se harán en pesos mexicanos (MXN), por transferencia nacional o internacional (SWIFT, mensaje MT103), desde cuentas a nombre del Cliente, </w:t>
       </w:r>
       <w:r>
         <w:rPr>
@@ -1381,7 +1381,7 @@
       </w:r>
       <w:r>
         <w:rPr/>
-        <w:t>. Sólo esos pagos liberan al Cliente. El Prestador nunca solicitará pagos a cuentas personales o de terceros; toda solicitud de pago a otra cuenta se considerará fraudulenta y el Cliente deberá confirmarla por correo electrónico con taxgr.interno@gmail.com antes de pagar. Si se paga en moneda extranjera, se aplicará el tipo de cambio publicado por el Banco de México en el Diario Oficial de la Federación el día del pago, y las comisiones y diferencias cambiarias serán a cargo del Cliente.</w:t>
+        <w:t>. Sólo esos pagos liberan al Cliente. En transferencias internacionales: (a) todas las comisiones del banco ordenante, intermediarios y corresponsales, así como las diferencias cambiarias, son a cargo del Cliente (instrucción de gastos OUR); (b) el pago se tiene por hecho sólo cuando el monto íntegro y neto se abona en la cuenta del Prestador; (c) el Cliente indicará como referencia la denominación de la empresa y enviará el comprobante SWIFT/MT103; y (d) cualquier faltante deberá cubrirse antes de continuar los Servicios. El Prestador nunca solicitará pagos a cuentas personales o de terceros; toda solicitud de pago a otra cuenta se considerará fraudulenta y el Cliente deberá confirmarla por correo electrónico con taxgr.interno@gmail.com antes de pagar.</w:t>
       </w:r>
     </w:p>
     <w:p>
@@ -1438,7 +1438,7 @@
       </w:r>
       <w:r>
         <w:rPr/>
-        <w:t xml:space="preserve"> Los Honorarios de etapas concluidas no son reembolsables. El pago a la firma retribuye la revisión documental, la identificación del Cliente y la preparación del Poder, y se devenga al iniciar los Servicios, salvo lo previsto en las Cláusulas 5.4, 8.8 a 8.12 y 12.5.</w:t>
+        <w:t xml:space="preserve"> Los Honorarios de etapas concluidas no son reembolsables. El primer pago de la etapa RFC retribuye la revisión documental, la identificación del Cliente y la preparación del Poder, y se devenga al iniciar los Servicios, salvo lo previsto en las Cláusulas 5.4, 8.8 a 8.12 y 12.5.</w:t>
       </w:r>
     </w:p>
     <w:p>
@@ -3450,7 +3450,7 @@
               <w:rPr>
                 <w:sz w:val="19"/>
               </w:rPr>
-              <w:t>Primera</w:t>
+              <w:t>RFC (1/2)</w:t>
             </w:r>
           </w:p>
         </w:tc>
@@ -3463,7 +3463,7 @@
               <w:rPr>
                 <w:sz w:val="19"/>
               </w:rPr>
-              <w:t>50%</w:t>
+              <w:t>50% RFC</w:t>
             </w:r>
           </w:p>
         </w:tc>
@@ -3476,7 +3476,7 @@
               <w:rPr>
                 <w:sz w:val="19"/>
               </w:rPr>
-              <w:t>$12,500.00</w:t>
+              <w:t>$6,000.00</w:t>
             </w:r>
           </w:p>
         </w:tc>
@@ -3504,7 +3504,7 @@
               <w:rPr>
                 <w:sz w:val="19"/>
               </w:rPr>
-              <w:t>Segunda</w:t>
+              <w:t>RFC (2/2)</w:t>
             </w:r>
           </w:p>
         </w:tc>
@@ -3517,7 +3517,7 @@
               <w:rPr>
                 <w:sz w:val="19"/>
               </w:rPr>
-              <w:t>50%</w:t>
+              <w:t>50% RFC</w:t>
             </w:r>
           </w:p>
         </w:tc>
@@ -3530,7 +3530,7 @@
               <w:rPr>
                 <w:sz w:val="19"/>
               </w:rPr>
-              <w:t>$12,500.00</w:t>
+              <w:t>$6,000.00</w:t>
             </w:r>
           </w:p>
         </w:tc>
@@ -3543,7 +3543,115 @@
               <w:rPr>
                 <w:sz w:val="19"/>
               </w:rPr>
-              <w:t>Conforme a la Cláusula 8.1(b).</w:t>
+              <w:t>A la Entrega del RFC y la CSF (8.1(a)).</w:t>
+            </w:r>
+          </w:p>
+        </w:tc>
+      </w:tr>
+      <w:tr>
+        <w:tc>
+          <w:tcPr>
+            <w:tcW w:type="dxa" w:w="2436"/>
+          </w:tcPr>
+          <w:p>
+            <w:r>
+              <w:rPr>
+                <w:sz w:val="19"/>
+              </w:rPr>
+              <w:t>e.firma (1/2)</w:t>
+            </w:r>
+          </w:p>
+        </w:tc>
+        <w:tc>
+          <w:tcPr>
+            <w:tcW w:type="dxa" w:w="2436"/>
+          </w:tcPr>
+          <w:p>
+            <w:r>
+              <w:rPr>
+                <w:sz w:val="19"/>
+              </w:rPr>
+              <w:t>50% e.firma</w:t>
+            </w:r>
+          </w:p>
+        </w:tc>
+        <w:tc>
+          <w:tcPr>
+            <w:tcW w:type="dxa" w:w="2436"/>
+          </w:tcPr>
+          <w:p>
+            <w:r>
+              <w:rPr>
+                <w:sz w:val="19"/>
+              </w:rPr>
+              <w:t>$6,500.00</w:t>
+            </w:r>
+          </w:p>
+        </w:tc>
+        <w:tc>
+          <w:tcPr>
+            <w:tcW w:type="dxa" w:w="2436"/>
+          </w:tcPr>
+          <w:p>
+            <w:r>
+              <w:rPr>
+                <w:sz w:val="19"/>
+              </w:rPr>
+              <w:t>Al inicio de la etapa e.firma (8.1(b)).</w:t>
+            </w:r>
+          </w:p>
+        </w:tc>
+      </w:tr>
+      <w:tr>
+        <w:tc>
+          <w:tcPr>
+            <w:tcW w:type="dxa" w:w="2436"/>
+          </w:tcPr>
+          <w:p>
+            <w:r>
+              <w:rPr>
+                <w:sz w:val="19"/>
+              </w:rPr>
+              <w:t>e.firma (2/2)</w:t>
+            </w:r>
+          </w:p>
+        </w:tc>
+        <w:tc>
+          <w:tcPr>
+            <w:tcW w:type="dxa" w:w="2436"/>
+          </w:tcPr>
+          <w:p>
+            <w:r>
+              <w:rPr>
+                <w:sz w:val="19"/>
+              </w:rPr>
+              <w:t>50% e.firma</w:t>
+            </w:r>
+          </w:p>
+        </w:tc>
+        <w:tc>
+          <w:tcPr>
+            <w:tcW w:type="dxa" w:w="2436"/>
+          </w:tcPr>
+          <w:p>
+            <w:r>
+              <w:rPr>
+                <w:sz w:val="19"/>
+              </w:rPr>
+              <w:t>$6,500.00</w:t>
+            </w:r>
+          </w:p>
+        </w:tc>
+        <w:tc>
+          <w:tcPr>
+            <w:tcW w:type="dxa" w:w="2436"/>
+          </w:tcPr>
+          <w:p>
+            <w:r>
+              <w:rPr>
+                <w:sz w:val="19"/>
+              </w:rPr>
+              <w:t>A la Entrega de la e.firma (8.1(b)).</w:t>
             </w:r>
           </w:p>
         </w:tc>
@@ -3631,6 +3739,31 @@
     </w:p>
     <w:p>
       <w:pPr>
+        <w:jc w:val="both"/>
+      </w:pPr>
+      <w:r>
+        <w:rPr>
+          <w:i/>
+          <w:sz w:val="19"/>
+        </w:rPr>
+      </w:r>
+      <w:r>
+        <w:rPr>
+          <w:b/>
+          <w:i/>
+          <w:sz w:val="19"/>
+        </w:rPr>
+        <w:t>Pago a la firma: $6,000.00 (50% Honorarios RFC) + $22,200.00 (100% Gastos de Terceros estimados) = $28,200.00.</w:t>
+      </w:r>
+      <w:r>
+        <w:rPr>
+          <w:i/>
+          <w:sz w:val="19"/>
+        </w:rPr>
+      </w:r>
+    </w:p>
+    <w:p>
+      <w:pPr>
         <w:keepNext/>
         <w:spacing w:before="160"/>
         <w:jc w:val="left"/>
@@ -3642,7 +3775,7 @@
         <w:rPr>
           <w:b/>
         </w:rPr>
-        <w:t>3. Gastos de Terceros (estimación; pago anticipado, Cláusula 8.2)</w:t>
+        <w:t>3. Gastos de Terceros (estimación; 100% a la firma, Cláusula 8.2)</w:t>
       </w:r>
       <w:r>
         <w:rPr/>
@@ -4377,7 +4510,19 @@
       </w:pPr>
       <w:r>
         <w:rPr/>
-        <w:t>Banco: BBVA · Titular: G&amp;R TAX-LEGAL CONSULTING, S.C. · Cuenta de cheques · CLABE: 012180001153583297 · Cuenta: 0115358329.</w:t>
+        <w:t>Banco: BBVA México, S.A. · SWIFT/BIC: BCMRMXMMPYM · Titular: G&amp;R TAX-LEGAL CONSULTING, S.C. · Cuenta de cheques en MXN · CLABE: 012180001153583297 · Cuenta: 0115358329.</w:t>
+      </w:r>
+    </w:p>
+    <w:p>
+      <w:pPr>
+        <w:jc w:val="both"/>
+      </w:pPr>
+      <w:r>
+        <w:rPr>
+          <w:i/>
+          <w:sz w:val="19"/>
+        </w:rPr>
+        <w:t>Transferencias internacionales: en pesos mexicanos (MXN), mensaje SWIFT MT103, gastos OUR (todas las comisiones y diferencias cambiarias a cargo del Cliente). Referencia: denominación de la empresa. Enviar comprobante SWIFT/MT103. El pago se tiene por hecho sólo con el abono íntegro y neto (Cláusula 8.4).</w:t>
       </w:r>
     </w:p>
     <w:p>

</xml_diff>

<commit_message>
G&R: pago por SPEI o SWIFT
</commit_message>
<xml_diff>
--- a/gr-tax-legal-presentacion/docs/contrato.docx
+++ b/gr-tax-legal-presentacion/docs/contrato.docx
@@ -1371,7 +1371,7 @@
       </w:r>
       <w:r>
         <w:rPr/>
-        <w:t xml:space="preserve"> Los pagos se harán en pesos mexicanos (MXN), por transferencia nacional o internacional (SWIFT, mensaje MT103), desde cuentas a nombre del Cliente, </w:t>
+        <w:t xml:space="preserve"> Los pagos se harán en pesos mexicanos (MXN), desde cuentas a nombre del Cliente, mediante: (i) transferencia nacional SPEI a la CLABE; o (ii) transferencia internacional SWIFT (mensaje MT103) a la cuenta o CLABE, </w:t>
       </w:r>
       <w:r>
         <w:rPr>
@@ -1381,7 +1381,7 @@
       </w:r>
       <w:r>
         <w:rPr/>
-        <w:t>. Sólo esos pagos liberan al Cliente. En transferencias internacionales: (a) todas las comisiones del banco ordenante, intermediarios y corresponsales, así como las diferencias cambiarias, son a cargo del Cliente (instrucción de gastos OUR); (b) el pago se tiene por hecho sólo cuando el monto íntegro y neto se abona en la cuenta del Prestador; (c) el Cliente indicará como referencia la denominación de la empresa y enviará el comprobante SWIFT/MT103; y (d) cualquier faltante deberá cubrirse antes de continuar los Servicios. El Prestador nunca solicitará pagos a cuentas personales o de terceros; toda solicitud de pago a otra cuenta se considerará fraudulenta y el Cliente deberá confirmarla por correo electrónico con taxgr.interno@gmail.com antes de pagar.</w:t>
+        <w:t>. Sólo esos pagos liberan al Cliente. En ambos casos: (a) todas las comisiones bancarias, de intermediarios y corresponsales, así como las diferencias cambiarias, son a cargo del Cliente (en SWIFT, instrucción de gastos OUR); (b) el pago se tiene por hecho sólo cuando el monto íntegro y neto se abona en la cuenta del Prestador; (c) el Cliente indicará como referencia la denominación de la empresa y enviará el comprobante (CEP de SPEI o MT103); y (d) cualquier faltante deberá cubrirse antes de continuar los Servicios. El Prestador nunca solicitará pagos a cuentas personales o de terceros; toda solicitud de pago a otra cuenta se considerará fraudulenta y el Cliente deberá confirmarla por correo electrónico con taxgr.interno@gmail.com antes de pagar.</w:t>
       </w:r>
     </w:p>
     <w:p>
@@ -4522,7 +4522,7 @@
           <w:i/>
           <w:sz w:val="19"/>
         </w:rPr>
-        <w:t>Transferencias internacionales: en pesos mexicanos (MXN), mensaje SWIFT MT103, gastos OUR (todas las comisiones y diferencias cambiarias a cargo del Cliente). Referencia: denominación de la empresa. Enviar comprobante SWIFT/MT103. El pago se tiene por hecho sólo con el abono íntegro y neto (Cláusula 8.4).</w:t>
+        <w:t>Desde México: SPEI a la CLABE. Desde el extranjero: SWIFT MT103 en MXN a la cuenta o CLABE, gastos OUR. En ambos casos, comisiones y diferencias cambiarias a cargo del Cliente; referencia: denominación de la empresa; enviar comprobante (CEP de SPEI o MT103). El pago se tiene por hecho sólo con el abono íntegro y neto (Cláusula 8.4).</w:t>
       </w:r>
     </w:p>
     <w:p>

</xml_diff>